<commit_message>
Hướng dẫn Ban Giám đốc: Dashboard có biểu đồ, thêm mục Tổng quan tài chính
Co-Authored-By: Claude Opus 5.5 <noreply@anthropic.com>
</commit_message>
<xml_diff>
--- a/doc/demo/huong-dan/02_BAN_GIAM_DOC.docx
+++ b/doc/demo/huong-dan/02_BAN_GIAM_DOC.docx
@@ -499,7 +499,7 @@
           <w:sz w:val="21"/>
           <w:szCs w:val="21"/>
         </w:rPr>
-        <w:t xml:space="preserve">5. Lãi/lỗ theo công trình</w:t>
+        <w:t xml:space="preserve">5. Tổng quan tài chính</w:t>
       </w:r>
     </w:p>
     <w:p>
@@ -516,7 +516,7 @@
           <w:sz w:val="21"/>
           <w:szCs w:val="21"/>
         </w:rPr>
-        <w:t xml:space="preserve">6. Hiệu quả kinh doanh</w:t>
+        <w:t xml:space="preserve">6. Lãi/lỗ theo công trình</w:t>
       </w:r>
     </w:p>
     <w:p>
@@ -533,7 +533,7 @@
           <w:sz w:val="21"/>
           <w:szCs w:val="21"/>
         </w:rPr>
-        <w:t xml:space="preserve">7. Theo dõi công trường</w:t>
+        <w:t xml:space="preserve">7. Hiệu quả kinh doanh</w:t>
       </w:r>
     </w:p>
     <w:p>
@@ -550,7 +550,7 @@
           <w:sz w:val="21"/>
           <w:szCs w:val="21"/>
         </w:rPr>
-        <w:t xml:space="preserve">8. Thời hạn xử lý và hạn mức phê duyệt</w:t>
+        <w:t xml:space="preserve">8. Theo dõi công trường</w:t>
       </w:r>
     </w:p>
     <w:p>
@@ -567,7 +567,24 @@
           <w:sz w:val="21"/>
           <w:szCs w:val="21"/>
         </w:rPr>
-        <w:t xml:space="preserve">9. Câu hỏi thường gặp</w:t>
+        <w:t xml:space="preserve">9. Thời hạn xử lý và hạn mức phê duyệt</w:t>
+      </w:r>
+    </w:p>
+    <w:p>
+      <w:pPr>
+        <w:spacing w:after="60" w:line="264"/>
+        <w:ind w:left="0"/>
+      </w:pPr>
+      <w:r>
+        <w:rPr>
+          <w:rFonts w:ascii="Calibri" w:cs="Calibri" w:eastAsia="Calibri" w:hAnsi="Calibri"/>
+          <w:b/>
+          <w:bCs/>
+          <w:color w:val="1F2933"/>
+          <w:sz w:val="21"/>
+          <w:szCs w:val="21"/>
+        </w:rPr>
+        <w:t xml:space="preserve">10. Câu hỏi thường gặp</w:t>
       </w:r>
     </w:p>
     <w:p>
@@ -705,9 +722,9 @@
         </w:tblBorders>
       </w:tblPr>
       <w:tblGrid>
-        <w:gridCol w:w="4240"/>
-        <w:gridCol w:w="2990"/>
-        <w:gridCol w:w="2408"/>
+        <w:gridCol w:w="4296"/>
+        <w:gridCol w:w="2911"/>
+        <w:gridCol w:w="2431"/>
       </w:tblGrid>
       <w:tr>
         <w:trPr>
@@ -715,7 +732,7 @@
         </w:trPr>
         <w:tc>
           <w:tcPr>
-            <w:tcW w:type="dxa" w:w="4240"/>
+            <w:tcW w:type="dxa" w:w="4296"/>
             <w:shd w:fill="EAF1EE" w:color="auto" w:val="clear"/>
             <w:tcMar>
               <w:top w:type="dxa" w:w="60"/>
@@ -745,7 +762,7 @@
         </w:tc>
         <w:tc>
           <w:tcPr>
-            <w:tcW w:type="dxa" w:w="2990"/>
+            <w:tcW w:type="dxa" w:w="2911"/>
             <w:shd w:fill="EAF1EE" w:color="auto" w:val="clear"/>
             <w:tcMar>
               <w:top w:type="dxa" w:w="60"/>
@@ -775,7 +792,7 @@
         </w:tc>
         <w:tc>
           <w:tcPr>
-            <w:tcW w:type="dxa" w:w="2408"/>
+            <w:tcW w:type="dxa" w:w="2431"/>
             <w:shd w:fill="EAF1EE" w:color="auto" w:val="clear"/>
             <w:tcMar>
               <w:top w:type="dxa" w:w="60"/>
@@ -810,7 +827,7 @@
         </w:trPr>
         <w:tc>
           <w:tcPr>
-            <w:tcW w:type="dxa" w:w="4240"/>
+            <w:tcW w:type="dxa" w:w="4296"/>
             <w:tcMar>
               <w:top w:type="dxa" w:w="60"/>
               <w:left w:type="dxa" w:w="90"/>
@@ -839,7 +856,7 @@
         </w:tc>
         <w:tc>
           <w:tcPr>
-            <w:tcW w:type="dxa" w:w="2990"/>
+            <w:tcW w:type="dxa" w:w="2911"/>
             <w:tcMar>
               <w:top w:type="dxa" w:w="60"/>
               <w:left w:type="dxa" w:w="90"/>
@@ -868,7 +885,7 @@
         </w:tc>
         <w:tc>
           <w:tcPr>
-            <w:tcW w:type="dxa" w:w="2408"/>
+            <w:tcW w:type="dxa" w:w="2431"/>
             <w:tcMar>
               <w:top w:type="dxa" w:w="60"/>
               <w:left w:type="dxa" w:w="90"/>
@@ -902,7 +919,7 @@
         </w:trPr>
         <w:tc>
           <w:tcPr>
-            <w:tcW w:type="dxa" w:w="4240"/>
+            <w:tcW w:type="dxa" w:w="4296"/>
             <w:tcMar>
               <w:top w:type="dxa" w:w="60"/>
               <w:left w:type="dxa" w:w="90"/>
@@ -931,7 +948,7 @@
         </w:tc>
         <w:tc>
           <w:tcPr>
-            <w:tcW w:type="dxa" w:w="2990"/>
+            <w:tcW w:type="dxa" w:w="2911"/>
             <w:tcMar>
               <w:top w:type="dxa" w:w="60"/>
               <w:left w:type="dxa" w:w="90"/>
@@ -973,7 +990,7 @@
         </w:tc>
         <w:tc>
           <w:tcPr>
-            <w:tcW w:type="dxa" w:w="2408"/>
+            <w:tcW w:type="dxa" w:w="2431"/>
             <w:tcMar>
               <w:top w:type="dxa" w:w="60"/>
               <w:left w:type="dxa" w:w="90"/>
@@ -1007,7 +1024,7 @@
         </w:trPr>
         <w:tc>
           <w:tcPr>
-            <w:tcW w:type="dxa" w:w="4240"/>
+            <w:tcW w:type="dxa" w:w="4296"/>
             <w:tcMar>
               <w:top w:type="dxa" w:w="60"/>
               <w:left w:type="dxa" w:w="90"/>
@@ -1036,7 +1053,7 @@
         </w:tc>
         <w:tc>
           <w:tcPr>
-            <w:tcW w:type="dxa" w:w="2990"/>
+            <w:tcW w:type="dxa" w:w="2911"/>
             <w:tcMar>
               <w:top w:type="dxa" w:w="60"/>
               <w:left w:type="dxa" w:w="90"/>
@@ -1065,7 +1082,7 @@
         </w:tc>
         <w:tc>
           <w:tcPr>
-            <w:tcW w:type="dxa" w:w="2408"/>
+            <w:tcW w:type="dxa" w:w="2431"/>
             <w:tcMar>
               <w:top w:type="dxa" w:w="60"/>
               <w:left w:type="dxa" w:w="90"/>
@@ -1099,7 +1116,7 @@
         </w:trPr>
         <w:tc>
           <w:tcPr>
-            <w:tcW w:type="dxa" w:w="4240"/>
+            <w:tcW w:type="dxa" w:w="4296"/>
             <w:tcMar>
               <w:top w:type="dxa" w:w="60"/>
               <w:left w:type="dxa" w:w="90"/>
@@ -1122,13 +1139,13 @@
                 <w:sz w:val="19"/>
                 <w:szCs w:val="19"/>
               </w:rPr>
-              <w:t xml:space="preserve">Xem hiệu quả kinh doanh: nguồn khách, phễu bán hàng, tỷ lệ trúng thầu</w:t>
-            </w:r>
-          </w:p>
-        </w:tc>
-        <w:tc>
-          <w:tcPr>
-            <w:tcW w:type="dxa" w:w="2990"/>
+              <w:t xml:space="preserve">Xem doanh thu, thu, chi theo tháng / quý / năm bằng biểu đồ, xuất Excel / PDF</w:t>
+            </w:r>
+          </w:p>
+        </w:tc>
+        <w:tc>
+          <w:tcPr>
+            <w:tcW w:type="dxa" w:w="2911"/>
             <w:tcMar>
               <w:top w:type="dxa" w:w="60"/>
               <w:left w:type="dxa" w:w="90"/>
@@ -1151,13 +1168,13 @@
                 <w:sz w:val="19"/>
                 <w:szCs w:val="19"/>
               </w:rPr>
-              <w:t xml:space="preserve">Hiệu quả kinh doanh</w:t>
-            </w:r>
-          </w:p>
-        </w:tc>
-        <w:tc>
-          <w:tcPr>
-            <w:tcW w:type="dxa" w:w="2408"/>
+              <w:t xml:space="preserve">Tổng quan tài chính</w:t>
+            </w:r>
+          </w:p>
+        </w:tc>
+        <w:tc>
+          <w:tcPr>
+            <w:tcW w:type="dxa" w:w="2431"/>
             <w:tcMar>
               <w:top w:type="dxa" w:w="60"/>
               <w:left w:type="dxa" w:w="90"/>
@@ -1180,7 +1197,7 @@
                 <w:sz w:val="19"/>
                 <w:szCs w:val="19"/>
               </w:rPr>
-              <w:t xml:space="preserve">Hằng tháng</w:t>
+              <w:t xml:space="preserve">Hằng tuần, hằng tháng</w:t>
             </w:r>
           </w:p>
         </w:tc>
@@ -1191,7 +1208,7 @@
         </w:trPr>
         <w:tc>
           <w:tcPr>
-            <w:tcW w:type="dxa" w:w="4240"/>
+            <w:tcW w:type="dxa" w:w="4296"/>
             <w:tcMar>
               <w:top w:type="dxa" w:w="60"/>
               <w:left w:type="dxa" w:w="90"/>
@@ -1214,13 +1231,13 @@
                 <w:sz w:val="19"/>
                 <w:szCs w:val="19"/>
               </w:rPr>
-              <w:t xml:space="preserve">Theo dõi công trường: đề nghị vật tư đang kẹt ở đâu</w:t>
-            </w:r>
-          </w:p>
-        </w:tc>
-        <w:tc>
-          <w:tcPr>
-            <w:tcW w:type="dxa" w:w="2990"/>
+              <w:t xml:space="preserve">Xem hiệu quả kinh doanh: nguồn khách, phễu bán hàng, tỷ lệ trúng thầu</w:t>
+            </w:r>
+          </w:p>
+        </w:tc>
+        <w:tc>
+          <w:tcPr>
+            <w:tcW w:type="dxa" w:w="2911"/>
             <w:tcMar>
               <w:top w:type="dxa" w:w="60"/>
               <w:left w:type="dxa" w:w="90"/>
@@ -1243,13 +1260,13 @@
                 <w:sz w:val="19"/>
                 <w:szCs w:val="19"/>
               </w:rPr>
-              <w:t xml:space="preserve">Theo dõi đề nghị</w:t>
-            </w:r>
-          </w:p>
-        </w:tc>
-        <w:tc>
-          <w:tcPr>
-            <w:tcW w:type="dxa" w:w="2408"/>
+              <w:t xml:space="preserve">Hiệu quả kinh doanh</w:t>
+            </w:r>
+          </w:p>
+        </w:tc>
+        <w:tc>
+          <w:tcPr>
+            <w:tcW w:type="dxa" w:w="2431"/>
             <w:tcMar>
               <w:top w:type="dxa" w:w="60"/>
               <w:left w:type="dxa" w:w="90"/>
@@ -1272,7 +1289,7 @@
                 <w:sz w:val="19"/>
                 <w:szCs w:val="19"/>
               </w:rPr>
-              <w:t xml:space="preserve">Khi cần</w:t>
+              <w:t xml:space="preserve">Hằng tháng</w:t>
             </w:r>
           </w:p>
         </w:tc>
@@ -1283,7 +1300,7 @@
         </w:trPr>
         <w:tc>
           <w:tcPr>
-            <w:tcW w:type="dxa" w:w="4240"/>
+            <w:tcW w:type="dxa" w:w="4296"/>
             <w:tcMar>
               <w:top w:type="dxa" w:w="60"/>
               <w:left w:type="dxa" w:w="90"/>
@@ -1306,13 +1323,42 @@
                 <w:sz w:val="19"/>
                 <w:szCs w:val="19"/>
               </w:rPr>
-              <w:t xml:space="preserve">Quyết định thời hạn xử lý và hạn mức phê duyệt</w:t>
-            </w:r>
-          </w:p>
-        </w:tc>
-        <w:tc>
-          <w:tcPr>
-            <w:tcW w:type="dxa" w:w="2990"/>
+              <w:t xml:space="preserve">Theo dõi công trường: đề nghị vật tư đang kẹt ở đâu</w:t>
+            </w:r>
+          </w:p>
+        </w:tc>
+        <w:tc>
+          <w:tcPr>
+            <w:tcW w:type="dxa" w:w="2911"/>
+            <w:tcMar>
+              <w:top w:type="dxa" w:w="60"/>
+              <w:left w:type="dxa" w:w="90"/>
+              <w:bottom w:type="dxa" w:w="60"/>
+              <w:right w:type="dxa" w:w="90"/>
+            </w:tcMar>
+          </w:tcPr>
+          <w:p>
+            <w:pPr>
+              <w:spacing w:after="0" w:line="252"/>
+            </w:pPr>
+            <w:r>
+              <w:rPr>
+                <w:rFonts w:ascii="Calibri" w:cs="Calibri" w:eastAsia="Calibri" w:hAnsi="Calibri"/>
+                <w:b/>
+                <w:bCs/>
+                <w:i w:val="false"/>
+                <w:iCs w:val="false"/>
+                <w:color w:val="1F2933"/>
+                <w:sz w:val="19"/>
+                <w:szCs w:val="19"/>
+              </w:rPr>
+              <w:t xml:space="preserve">Theo dõi đề nghị</w:t>
+            </w:r>
+          </w:p>
+        </w:tc>
+        <w:tc>
+          <w:tcPr>
+            <w:tcW w:type="dxa" w:w="2431"/>
             <w:tcMar>
               <w:top w:type="dxa" w:w="60"/>
               <w:left w:type="dxa" w:w="90"/>
@@ -1335,13 +1381,76 @@
                 <w:sz w:val="19"/>
                 <w:szCs w:val="19"/>
               </w:rPr>
+              <w:t xml:space="preserve">Khi cần</w:t>
+            </w:r>
+          </w:p>
+        </w:tc>
+      </w:tr>
+      <w:tr>
+        <w:trPr>
+          <w:cantSplit/>
+        </w:trPr>
+        <w:tc>
+          <w:tcPr>
+            <w:tcW w:type="dxa" w:w="4296"/>
+            <w:tcMar>
+              <w:top w:type="dxa" w:w="60"/>
+              <w:left w:type="dxa" w:w="90"/>
+              <w:bottom w:type="dxa" w:w="60"/>
+              <w:right w:type="dxa" w:w="90"/>
+            </w:tcMar>
+          </w:tcPr>
+          <w:p>
+            <w:pPr>
+              <w:spacing w:after="0" w:line="252"/>
+            </w:pPr>
+            <w:r>
+              <w:rPr>
+                <w:rFonts w:ascii="Calibri" w:cs="Calibri" w:eastAsia="Calibri" w:hAnsi="Calibri"/>
+                <w:b w:val="false"/>
+                <w:bCs w:val="false"/>
+                <w:i w:val="false"/>
+                <w:iCs w:val="false"/>
+                <w:color w:val="1F2933"/>
+                <w:sz w:val="19"/>
+                <w:szCs w:val="19"/>
+              </w:rPr>
+              <w:t xml:space="preserve">Quyết định thời hạn xử lý và hạn mức phê duyệt</w:t>
+            </w:r>
+          </w:p>
+        </w:tc>
+        <w:tc>
+          <w:tcPr>
+            <w:tcW w:type="dxa" w:w="2911"/>
+            <w:tcMar>
+              <w:top w:type="dxa" w:w="60"/>
+              <w:left w:type="dxa" w:w="90"/>
+              <w:bottom w:type="dxa" w:w="60"/>
+              <w:right w:type="dxa" w:w="90"/>
+            </w:tcMar>
+          </w:tcPr>
+          <w:p>
+            <w:pPr>
+              <w:spacing w:after="0" w:line="252"/>
+            </w:pPr>
+            <w:r>
+              <w:rPr>
+                <w:rFonts w:ascii="Calibri" w:cs="Calibri" w:eastAsia="Calibri" w:hAnsi="Calibri"/>
+                <w:b w:val="false"/>
+                <w:bCs w:val="false"/>
+                <w:i w:val="false"/>
+                <w:iCs w:val="false"/>
+                <w:color w:val="1F2933"/>
+                <w:sz w:val="19"/>
+                <w:szCs w:val="19"/>
+              </w:rPr>
               <w:t xml:space="preserve">Quản trị viên nhập theo quyết định của Ban Giám đốc</w:t>
             </w:r>
           </w:p>
         </w:tc>
         <w:tc>
           <w:tcPr>
-            <w:tcW w:type="dxa" w:w="2408"/>
+            <w:tcW w:type="dxa" w:w="2431"/>
             <w:tcMar>
               <w:top w:type="dxa" w:w="60"/>
               <w:left w:type="dxa" w:w="90"/>
@@ -1600,20 +1709,20 @@
           <w:sz w:val="21"/>
           <w:szCs w:val="21"/>
         </w:rPr>
-        <w:t xml:space="preserve">Trang đầu tiên sau khi đăng nhập. Mỗi thẻ là một nhóm chỉ số; </w:t>
-      </w:r>
-      <w:r>
-        <w:rPr>
-          <w:rFonts w:ascii="Calibri" w:cs="Calibri" w:eastAsia="Calibri" w:hAnsi="Calibri"/>
-          <w:b/>
-          <w:bCs/>
-          <w:i w:val="false"/>
-          <w:iCs w:val="false"/>
-          <w:color w:val="1F2933"/>
-          <w:sz w:val="21"/>
-          <w:szCs w:val="21"/>
-        </w:rPr>
-        <w:t xml:space="preserve">bấm vào thẻ</w:t>
+        <w:t xml:space="preserve">Trang đầu tiên sau khi đăng nhập. Hàng nút </w:t>
+      </w:r>
+      <w:r>
+        <w:rPr>
+          <w:rFonts w:ascii="Calibri" w:cs="Calibri" w:eastAsia="Calibri" w:hAnsi="Calibri"/>
+          <w:b/>
+          <w:bCs/>
+          <w:i w:val="false"/>
+          <w:iCs w:val="false"/>
+          <w:color w:val="1F2933"/>
+          <w:sz w:val="21"/>
+          <w:szCs w:val="21"/>
+        </w:rPr>
+        <w:t xml:space="preserve">Kỳ báo cáo</w:t>
       </w:r>
       <w:r>
         <w:rPr>
@@ -1626,20 +1735,26 @@
           <w:sz w:val="21"/>
           <w:szCs w:val="21"/>
         </w:rPr>
-        <w:t xml:space="preserve"> để mở danh sách đã lọc sẵn. Hàng nút </w:t>
-      </w:r>
-      <w:r>
-        <w:rPr>
-          <w:rFonts w:ascii="Calibri" w:cs="Calibri" w:eastAsia="Calibri" w:hAnsi="Calibri"/>
-          <w:b/>
-          <w:bCs/>
-          <w:i w:val="false"/>
-          <w:iCs w:val="false"/>
-          <w:color w:val="1F2933"/>
-          <w:sz w:val="21"/>
-          <w:szCs w:val="21"/>
-        </w:rPr>
-        <w:t xml:space="preserve">Kỳ báo cáo</w:t>
+        <w:t xml:space="preserve"> (Tháng này · Quý này · Năm nay · Tất cả) đổi khoảng thời gian cho mọi số liệu bên dưới.</w:t>
+      </w:r>
+    </w:p>
+    <w:p>
+      <w:pPr>
+        <w:spacing w:after="140" w:line="276"/>
+        <w:jc w:val="left"/>
+      </w:pPr>
+      <w:r>
+        <w:rPr>
+          <w:rFonts w:ascii="Calibri" w:cs="Calibri" w:eastAsia="Calibri" w:hAnsi="Calibri"/>
+          <w:b/>
+          <w:bCs/>
+          <w:i w:val="false"/>
+          <w:iCs w:val="false"/>
+          <w:color w:val="1F2933"/>
+          <w:sz w:val="21"/>
+          <w:szCs w:val="21"/>
+        </w:rPr>
+        <w:t xml:space="preserve">Phần trên — Tổng quan tài chính</w:t>
       </w:r>
       <w:r>
         <w:rPr>
@@ -1652,7 +1767,219 @@
           <w:sz w:val="21"/>
           <w:szCs w:val="21"/>
         </w:rPr>
-        <w:t xml:space="preserve"> (Tháng này · Quý này · Năm nay · Tất cả) đổi khoảng thời gian cho các thẻ.</w:t>
+        <w:t xml:space="preserve"> (chỉ hiện với Ban Giám đốc, Giám đốc Tài chính, Kế toán):</w:t>
+      </w:r>
+    </w:p>
+    <w:p>
+      <w:pPr>
+        <w:pStyle w:val="ListParagraph"/>
+        <w:numPr>
+          <w:ilvl w:val="0"/>
+          <w:numId w:val="2"/>
+        </w:numPr>
+        <w:spacing w:after="70" w:line="276"/>
+      </w:pPr>
+      <w:r>
+        <w:rPr>
+          <w:rFonts w:ascii="Calibri" w:cs="Calibri" w:eastAsia="Calibri" w:hAnsi="Calibri"/>
+          <w:b/>
+          <w:bCs/>
+          <w:i w:val="false"/>
+          <w:iCs w:val="false"/>
+          <w:color w:val="1F2933"/>
+          <w:sz w:val="21"/>
+          <w:szCs w:val="21"/>
+        </w:rPr>
+        <w:t xml:space="preserve">Bốn ô chỉ số</w:t>
+      </w:r>
+      <w:r>
+        <w:rPr>
+          <w:rFonts w:ascii="Calibri" w:cs="Calibri" w:eastAsia="Calibri" w:hAnsi="Calibri"/>
+          <w:b w:val="false"/>
+          <w:bCs w:val="false"/>
+          <w:i w:val="false"/>
+          <w:iCs w:val="false"/>
+          <w:color w:val="1F2933"/>
+          <w:sz w:val="21"/>
+          <w:szCs w:val="21"/>
+        </w:rPr>
+        <w:t xml:space="preserve">: Doanh thu · Đã thu · Đã chi · Dòng tiền ròng (thu − chi). Mỗi ô ghi số rút gọn («1,3 tỷ»), số đầy đủ ngay dưới, và </w:t>
+      </w:r>
+      <w:r>
+        <w:rPr>
+          <w:rFonts w:ascii="Calibri" w:cs="Calibri" w:eastAsia="Calibri" w:hAnsi="Calibri"/>
+          <w:b/>
+          <w:bCs/>
+          <w:i w:val="false"/>
+          <w:iCs w:val="false"/>
+          <w:color w:val="1F2933"/>
+          <w:sz w:val="21"/>
+          <w:szCs w:val="21"/>
+        </w:rPr>
+        <w:t xml:space="preserve">so với kỳ trước cùng độ dài</w:t>
+      </w:r>
+      <w:r>
+        <w:rPr>
+          <w:rFonts w:ascii="Calibri" w:cs="Calibri" w:eastAsia="Calibri" w:hAnsi="Calibri"/>
+          <w:b w:val="false"/>
+          <w:bCs w:val="false"/>
+          <w:i w:val="false"/>
+          <w:iCs w:val="false"/>
+          <w:color w:val="1F2933"/>
+          <w:sz w:val="21"/>
+          <w:szCs w:val="21"/>
+        </w:rPr>
+        <w:t xml:space="preserve"> — ví dụ 9 ngày đầu tháng này so với 9 ngày đầu tháng trước. Kỳ trước chưa có dữ liệu thì ghi «Chưa có kỳ trước để so sánh», không tự dựng phần trăm.</w:t>
+      </w:r>
+    </w:p>
+    <w:p>
+      <w:pPr>
+        <w:pStyle w:val="ListParagraph"/>
+        <w:numPr>
+          <w:ilvl w:val="0"/>
+          <w:numId w:val="2"/>
+        </w:numPr>
+        <w:spacing w:after="70" w:line="276"/>
+      </w:pPr>
+      <w:r>
+        <w:rPr>
+          <w:rFonts w:ascii="Calibri" w:cs="Calibri" w:eastAsia="Calibri" w:hAnsi="Calibri"/>
+          <w:b/>
+          <w:bCs/>
+          <w:i w:val="false"/>
+          <w:iCs w:val="false"/>
+          <w:color w:val="1F2933"/>
+          <w:sz w:val="21"/>
+          <w:szCs w:val="21"/>
+        </w:rPr>
+        <w:t xml:space="preserve">Doanh thu và tiền đã thu</w:t>
+      </w:r>
+      <w:r>
+        <w:rPr>
+          <w:rFonts w:ascii="Calibri" w:cs="Calibri" w:eastAsia="Calibri" w:hAnsi="Calibri"/>
+          <w:b w:val="false"/>
+          <w:bCs w:val="false"/>
+          <w:i w:val="false"/>
+          <w:iCs w:val="false"/>
+          <w:color w:val="1F2933"/>
+          <w:sz w:val="21"/>
+          <w:szCs w:val="21"/>
+        </w:rPr>
+        <w:t xml:space="preserve">, </w:t>
+      </w:r>
+      <w:r>
+        <w:rPr>
+          <w:rFonts w:ascii="Calibri" w:cs="Calibri" w:eastAsia="Calibri" w:hAnsi="Calibri"/>
+          <w:b/>
+          <w:bCs/>
+          <w:i w:val="false"/>
+          <w:iCs w:val="false"/>
+          <w:color w:val="1F2933"/>
+          <w:sz w:val="21"/>
+          <w:szCs w:val="21"/>
+        </w:rPr>
+        <w:t xml:space="preserve">Thu – chi</w:t>
+      </w:r>
+      <w:r>
+        <w:rPr>
+          <w:rFonts w:ascii="Calibri" w:cs="Calibri" w:eastAsia="Calibri" w:hAnsi="Calibri"/>
+          <w:b w:val="false"/>
+          <w:bCs w:val="false"/>
+          <w:i w:val="false"/>
+          <w:iCs w:val="false"/>
+          <w:color w:val="1F2933"/>
+          <w:sz w:val="21"/>
+          <w:szCs w:val="21"/>
+        </w:rPr>
+        <w:t xml:space="preserve">: biểu đồ cột theo kỳ; nút </w:t>
+      </w:r>
+      <w:r>
+        <w:rPr>
+          <w:rFonts w:ascii="Calibri" w:cs="Calibri" w:eastAsia="Calibri" w:hAnsi="Calibri"/>
+          <w:b/>
+          <w:bCs/>
+          <w:i w:val="false"/>
+          <w:iCs w:val="false"/>
+          <w:color w:val="1F2933"/>
+          <w:sz w:val="21"/>
+          <w:szCs w:val="21"/>
+        </w:rPr>
+        <w:t xml:space="preserve">Tháng / Quý / Năm</w:t>
+      </w:r>
+      <w:r>
+        <w:rPr>
+          <w:rFonts w:ascii="Calibri" w:cs="Calibri" w:eastAsia="Calibri" w:hAnsi="Calibri"/>
+          <w:b w:val="false"/>
+          <w:bCs w:val="false"/>
+          <w:i w:val="false"/>
+          <w:iCs w:val="false"/>
+          <w:color w:val="1F2933"/>
+          <w:sz w:val="21"/>
+          <w:szCs w:val="21"/>
+        </w:rPr>
+        <w:t xml:space="preserve"> trên mỗi biểu đồ đổi cách chia. Rê chuột (hoặc chạm) vào cột để xem số đầy đủ.</w:t>
+      </w:r>
+    </w:p>
+    <w:p>
+      <w:pPr>
+        <w:pStyle w:val="ListParagraph"/>
+        <w:numPr>
+          <w:ilvl w:val="0"/>
+          <w:numId w:val="2"/>
+        </w:numPr>
+        <w:spacing w:after="70" w:line="276"/>
+      </w:pPr>
+      <w:r>
+        <w:rPr>
+          <w:rFonts w:ascii="Calibri" w:cs="Calibri" w:eastAsia="Calibri" w:hAnsi="Calibri"/>
+          <w:b/>
+          <w:bCs/>
+          <w:i w:val="false"/>
+          <w:iCs w:val="false"/>
+          <w:color w:val="1F2933"/>
+          <w:sz w:val="21"/>
+          <w:szCs w:val="21"/>
+        </w:rPr>
+        <w:t xml:space="preserve">Công nợ phải thu theo tuổi nợ</w:t>
+      </w:r>
+      <w:r>
+        <w:rPr>
+          <w:rFonts w:ascii="Calibri" w:cs="Calibri" w:eastAsia="Calibri" w:hAnsi="Calibri"/>
+          <w:b w:val="false"/>
+          <w:bCs w:val="false"/>
+          <w:i w:val="false"/>
+          <w:iCs w:val="false"/>
+          <w:color w:val="1F2933"/>
+          <w:sz w:val="21"/>
+          <w:szCs w:val="21"/>
+        </w:rPr>
+        <w:t xml:space="preserve"> và </w:t>
+      </w:r>
+      <w:r>
+        <w:rPr>
+          <w:rFonts w:ascii="Calibri" w:cs="Calibri" w:eastAsia="Calibri" w:hAnsi="Calibri"/>
+          <w:b/>
+          <w:bCs/>
+          <w:i w:val="false"/>
+          <w:iCs w:val="false"/>
+          <w:color w:val="1F2933"/>
+          <w:sz w:val="21"/>
+          <w:szCs w:val="21"/>
+        </w:rPr>
+        <w:t xml:space="preserve">Lãi/lỗ thực tế theo công trình</w:t>
+      </w:r>
+      <w:r>
+        <w:rPr>
+          <w:rFonts w:ascii="Calibri" w:cs="Calibri" w:eastAsia="Calibri" w:hAnsi="Calibri"/>
+          <w:b w:val="false"/>
+          <w:bCs w:val="false"/>
+          <w:i w:val="false"/>
+          <w:iCs w:val="false"/>
+          <w:color w:val="1F2933"/>
+          <w:sz w:val="21"/>
+          <w:szCs w:val="21"/>
+        </w:rPr>
+        <w:t xml:space="preserve">: số tại thời điểm xem, bấm liên kết dưới mỗi khung để mở màn hình chi tiết.</w:t>
       </w:r>
     </w:p>
     <w:p>
@@ -1716,625 +2043,40 @@
           <w:sz w:val="18"/>
           <w:szCs w:val="18"/>
         </w:rPr>
-        <w:t xml:space="preserve">Hình 1 — Dashboard của Tổng Giám đốc, đang xem Toàn NVG, kỳ Năm nay.</w:t>
-      </w:r>
-    </w:p>
-    <w:tbl>
-      <w:tblPr>
-        <w:tblW w:type="dxa" w:w="9638"/>
-        <w:tblBorders>
-          <w:top w:val="single" w:color="C9D2CE" w:sz="4"/>
-          <w:left w:val="single" w:color="C9D2CE" w:sz="4"/>
-          <w:bottom w:val="single" w:color="C9D2CE" w:sz="4"/>
-          <w:right w:val="single" w:color="C9D2CE" w:sz="4"/>
-          <w:insideH w:val="single" w:color="C9D2CE" w:sz="4"/>
-          <w:insideV w:val="single" w:color="C9D2CE" w:sz="4"/>
-        </w:tblBorders>
-      </w:tblPr>
-      <w:tblGrid>
-        <w:gridCol w:w="3692"/>
-        <w:gridCol w:w="5946"/>
-      </w:tblGrid>
-      <w:tr>
-        <w:trPr>
-          <w:tblHeader/>
-        </w:trPr>
-        <w:tc>
-          <w:tcPr>
-            <w:tcW w:type="dxa" w:w="3692"/>
-            <w:shd w:fill="EAF1EE" w:color="auto" w:val="clear"/>
-            <w:tcMar>
-              <w:top w:type="dxa" w:w="60"/>
-              <w:left w:type="dxa" w:w="90"/>
-              <w:bottom w:type="dxa" w:w="60"/>
-              <w:right w:type="dxa" w:w="90"/>
-            </w:tcMar>
-          </w:tcPr>
-          <w:p>
-            <w:pPr>
-              <w:spacing w:after="0" w:line="252"/>
-            </w:pPr>
-            <w:r>
-              <w:rPr>
-                <w:rFonts w:ascii="Calibri" w:cs="Calibri" w:eastAsia="Calibri" w:hAnsi="Calibri"/>
-                <w:b/>
-                <w:bCs/>
-                <w:i w:val="false"/>
-                <w:iCs w:val="false"/>
-                <w:color w:val="1F2933"/>
-                <w:sz w:val="19"/>
-                <w:szCs w:val="19"/>
-              </w:rPr>
-              <w:t xml:space="preserve">Thẻ</w:t>
-            </w:r>
-          </w:p>
-        </w:tc>
-        <w:tc>
-          <w:tcPr>
-            <w:tcW w:type="dxa" w:w="5946"/>
-            <w:shd w:fill="EAF1EE" w:color="auto" w:val="clear"/>
-            <w:tcMar>
-              <w:top w:type="dxa" w:w="60"/>
-              <w:left w:type="dxa" w:w="90"/>
-              <w:bottom w:type="dxa" w:w="60"/>
-              <w:right w:type="dxa" w:w="90"/>
-            </w:tcMar>
-          </w:tcPr>
-          <w:p>
-            <w:pPr>
-              <w:spacing w:after="0" w:line="252"/>
-            </w:pPr>
-            <w:r>
-              <w:rPr>
-                <w:rFonts w:ascii="Calibri" w:cs="Calibri" w:eastAsia="Calibri" w:hAnsi="Calibri"/>
-                <w:b/>
-                <w:bCs/>
-                <w:i w:val="false"/>
-                <w:iCs w:val="false"/>
-                <w:color w:val="1F2933"/>
-                <w:sz w:val="19"/>
-                <w:szCs w:val="19"/>
-              </w:rPr>
-              <w:t xml:space="preserve">Cho biết</w:t>
-            </w:r>
-          </w:p>
-        </w:tc>
-      </w:tr>
-      <w:tr>
-        <w:trPr>
-          <w:cantSplit/>
-        </w:trPr>
-        <w:tc>
-          <w:tcPr>
-            <w:tcW w:type="dxa" w:w="3692"/>
-            <w:tcMar>
-              <w:top w:type="dxa" w:w="60"/>
-              <w:left w:type="dxa" w:w="90"/>
-              <w:bottom w:type="dxa" w:w="60"/>
-              <w:right w:type="dxa" w:w="90"/>
-            </w:tcMar>
-          </w:tcPr>
-          <w:p>
-            <w:pPr>
-              <w:spacing w:after="0" w:line="252"/>
-            </w:pPr>
-            <w:r>
-              <w:rPr>
-                <w:rFonts w:ascii="Calibri" w:cs="Calibri" w:eastAsia="Calibri" w:hAnsi="Calibri"/>
-                <w:b/>
-                <w:bCs/>
-                <w:i w:val="false"/>
-                <w:iCs w:val="false"/>
-                <w:color w:val="1F2933"/>
-                <w:sz w:val="19"/>
-                <w:szCs w:val="19"/>
-              </w:rPr>
-              <w:t xml:space="preserve">Chờ phê duyệt</w:t>
-            </w:r>
-          </w:p>
-        </w:tc>
-        <w:tc>
-          <w:tcPr>
-            <w:tcW w:type="dxa" w:w="5946"/>
-            <w:tcMar>
-              <w:top w:type="dxa" w:w="60"/>
-              <w:left w:type="dxa" w:w="90"/>
-              <w:bottom w:type="dxa" w:w="60"/>
-              <w:right w:type="dxa" w:w="90"/>
-            </w:tcMar>
-          </w:tcPr>
-          <w:p>
-            <w:pPr>
-              <w:spacing w:after="0" w:line="252"/>
-            </w:pPr>
-            <w:r>
-              <w:rPr>
-                <w:rFonts w:ascii="Calibri" w:cs="Calibri" w:eastAsia="Calibri" w:hAnsi="Calibri"/>
-                <w:b w:val="false"/>
-                <w:bCs w:val="false"/>
-                <w:i w:val="false"/>
-                <w:iCs w:val="false"/>
-                <w:color w:val="1F2933"/>
-                <w:sz w:val="19"/>
-                <w:szCs w:val="19"/>
-              </w:rPr>
-              <w:t xml:space="preserve">Số hồ sơ nằm trong hạn mức của vai trò đang chờ duyệt, và tổng giá trị</w:t>
-            </w:r>
-          </w:p>
-        </w:tc>
-      </w:tr>
-      <w:tr>
-        <w:trPr>
-          <w:cantSplit/>
-        </w:trPr>
-        <w:tc>
-          <w:tcPr>
-            <w:tcW w:type="dxa" w:w="3692"/>
-            <w:tcMar>
-              <w:top w:type="dxa" w:w="60"/>
-              <w:left w:type="dxa" w:w="90"/>
-              <w:bottom w:type="dxa" w:w="60"/>
-              <w:right w:type="dxa" w:w="90"/>
-            </w:tcMar>
-          </w:tcPr>
-          <w:p>
-            <w:pPr>
-              <w:spacing w:after="0" w:line="252"/>
-            </w:pPr>
-            <w:r>
-              <w:rPr>
-                <w:rFonts w:ascii="Calibri" w:cs="Calibri" w:eastAsia="Calibri" w:hAnsi="Calibri"/>
-                <w:b/>
-                <w:bCs/>
-                <w:i w:val="false"/>
-                <w:iCs w:val="false"/>
-                <w:color w:val="1F2933"/>
-                <w:sz w:val="19"/>
-                <w:szCs w:val="19"/>
-              </w:rPr>
-              <w:t xml:space="preserve">Quá hạn</w:t>
-            </w:r>
-          </w:p>
-        </w:tc>
-        <w:tc>
-          <w:tcPr>
-            <w:tcW w:type="dxa" w:w="5946"/>
-            <w:tcMar>
-              <w:top w:type="dxa" w:w="60"/>
-              <w:left w:type="dxa" w:w="90"/>
-              <w:bottom w:type="dxa" w:w="60"/>
-              <w:right w:type="dxa" w:w="90"/>
-            </w:tcMar>
-          </w:tcPr>
-          <w:p>
-            <w:pPr>
-              <w:spacing w:after="0" w:line="252"/>
-            </w:pPr>
-            <w:r>
-              <w:rPr>
-                <w:rFonts w:ascii="Calibri" w:cs="Calibri" w:eastAsia="Calibri" w:hAnsi="Calibri"/>
-                <w:b w:val="false"/>
-                <w:bCs w:val="false"/>
-                <w:i w:val="false"/>
-                <w:iCs w:val="false"/>
-                <w:color w:val="1F2933"/>
-                <w:sz w:val="19"/>
-                <w:szCs w:val="19"/>
-              </w:rPr>
-              <w:t xml:space="preserve">Hồ sơ vượt thời hạn xử lý, công nợ quá hạn thu, phê duyệt bị để lâu — gộp mọi phân hệ</w:t>
-            </w:r>
-          </w:p>
-        </w:tc>
-      </w:tr>
-      <w:tr>
-        <w:trPr>
-          <w:cantSplit/>
-        </w:trPr>
-        <w:tc>
-          <w:tcPr>
-            <w:tcW w:type="dxa" w:w="3692"/>
-            <w:tcMar>
-              <w:top w:type="dxa" w:w="60"/>
-              <w:left w:type="dxa" w:w="90"/>
-              <w:bottom w:type="dxa" w:w="60"/>
-              <w:right w:type="dxa" w:w="90"/>
-            </w:tcMar>
-          </w:tcPr>
-          <w:p>
-            <w:pPr>
-              <w:spacing w:after="0" w:line="252"/>
-            </w:pPr>
-            <w:r>
-              <w:rPr>
-                <w:rFonts w:ascii="Calibri" w:cs="Calibri" w:eastAsia="Calibri" w:hAnsi="Calibri"/>
-                <w:b/>
-                <w:bCs/>
-                <w:i w:val="false"/>
-                <w:iCs w:val="false"/>
-                <w:color w:val="1F2933"/>
-                <w:sz w:val="19"/>
-                <w:szCs w:val="19"/>
-              </w:rPr>
-              <w:t xml:space="preserve">Lãi/lỗ theo công trình</w:t>
-            </w:r>
-          </w:p>
-        </w:tc>
-        <w:tc>
-          <w:tcPr>
-            <w:tcW w:type="dxa" w:w="5946"/>
-            <w:tcMar>
-              <w:top w:type="dxa" w:w="60"/>
-              <w:left w:type="dxa" w:w="90"/>
-              <w:bottom w:type="dxa" w:w="60"/>
-              <w:right w:type="dxa" w:w="90"/>
-            </w:tcMar>
-          </w:tcPr>
-          <w:p>
-            <w:pPr>
-              <w:spacing w:after="0" w:line="252"/>
-            </w:pPr>
-            <w:r>
-              <w:rPr>
-                <w:rFonts w:ascii="Calibri" w:cs="Calibri" w:eastAsia="Calibri" w:hAnsi="Calibri"/>
-                <w:b w:val="false"/>
-                <w:bCs w:val="false"/>
-                <w:i w:val="false"/>
-                <w:iCs w:val="false"/>
-                <w:color w:val="1F2933"/>
-                <w:sz w:val="19"/>
-                <w:szCs w:val="19"/>
-              </w:rPr>
-              <w:t xml:space="preserve">Lối vào báo cáo lãi/lỗ</w:t>
-            </w:r>
-          </w:p>
-        </w:tc>
-      </w:tr>
-      <w:tr>
-        <w:trPr>
-          <w:cantSplit/>
-        </w:trPr>
-        <w:tc>
-          <w:tcPr>
-            <w:tcW w:type="dxa" w:w="3692"/>
-            <w:tcMar>
-              <w:top w:type="dxa" w:w="60"/>
-              <w:left w:type="dxa" w:w="90"/>
-              <w:bottom w:type="dxa" w:w="60"/>
-              <w:right w:type="dxa" w:w="90"/>
-            </w:tcMar>
-          </w:tcPr>
-          <w:p>
-            <w:pPr>
-              <w:spacing w:after="0" w:line="252"/>
-            </w:pPr>
-            <w:r>
-              <w:rPr>
-                <w:rFonts w:ascii="Calibri" w:cs="Calibri" w:eastAsia="Calibri" w:hAnsi="Calibri"/>
-                <w:b/>
-                <w:bCs/>
-                <w:i w:val="false"/>
-                <w:iCs w:val="false"/>
-                <w:color w:val="1F2933"/>
-                <w:sz w:val="19"/>
-                <w:szCs w:val="19"/>
-              </w:rPr>
-              <w:t xml:space="preserve">Dòng tiền</w:t>
-            </w:r>
-          </w:p>
-        </w:tc>
-        <w:tc>
-          <w:tcPr>
-            <w:tcW w:type="dxa" w:w="5946"/>
-            <w:tcMar>
-              <w:top w:type="dxa" w:w="60"/>
-              <w:left w:type="dxa" w:w="90"/>
-              <w:bottom w:type="dxa" w:w="60"/>
-              <w:right w:type="dxa" w:w="90"/>
-            </w:tcMar>
-          </w:tcPr>
-          <w:p>
-            <w:pPr>
-              <w:spacing w:after="0" w:line="252"/>
-            </w:pPr>
-            <w:r>
-              <w:rPr>
-                <w:rFonts w:ascii="Calibri" w:cs="Calibri" w:eastAsia="Calibri" w:hAnsi="Calibri"/>
-                <w:b w:val="false"/>
-                <w:bCs w:val="false"/>
-                <w:i w:val="false"/>
-                <w:iCs w:val="false"/>
-                <w:color w:val="1F2933"/>
-                <w:sz w:val="19"/>
-                <w:szCs w:val="19"/>
-              </w:rPr>
-              <w:t xml:space="preserve">Số dư cuối kỳ dự kiến: số dư đầu kỳ Kế toán đã lập, cộng thu, trừ chi, trừ khoản đã duyệt chưa chi</w:t>
-            </w:r>
-          </w:p>
-        </w:tc>
-      </w:tr>
-      <w:tr>
-        <w:trPr>
-          <w:cantSplit/>
-        </w:trPr>
-        <w:tc>
-          <w:tcPr>
-            <w:tcW w:type="dxa" w:w="3692"/>
-            <w:tcMar>
-              <w:top w:type="dxa" w:w="60"/>
-              <w:left w:type="dxa" w:w="90"/>
-              <w:bottom w:type="dxa" w:w="60"/>
-              <w:right w:type="dxa" w:w="90"/>
-            </w:tcMar>
-          </w:tcPr>
-          <w:p>
-            <w:pPr>
-              <w:spacing w:after="0" w:line="252"/>
-            </w:pPr>
-            <w:r>
-              <w:rPr>
-                <w:rFonts w:ascii="Calibri" w:cs="Calibri" w:eastAsia="Calibri" w:hAnsi="Calibri"/>
-                <w:b/>
-                <w:bCs/>
-                <w:i w:val="false"/>
-                <w:iCs w:val="false"/>
-                <w:color w:val="1F2933"/>
-                <w:sz w:val="19"/>
-                <w:szCs w:val="19"/>
-              </w:rPr>
-              <w:t xml:space="preserve">Công nợ phải thu</w:t>
-            </w:r>
-          </w:p>
-        </w:tc>
-        <w:tc>
-          <w:tcPr>
-            <w:tcW w:type="dxa" w:w="5946"/>
-            <w:tcMar>
-              <w:top w:type="dxa" w:w="60"/>
-              <w:left w:type="dxa" w:w="90"/>
-              <w:bottom w:type="dxa" w:w="60"/>
-              <w:right w:type="dxa" w:w="90"/>
-            </w:tcMar>
-          </w:tcPr>
-          <w:p>
-            <w:pPr>
-              <w:spacing w:after="0" w:line="252"/>
-            </w:pPr>
-            <w:r>
-              <w:rPr>
-                <w:rFonts w:ascii="Calibri" w:cs="Calibri" w:eastAsia="Calibri" w:hAnsi="Calibri"/>
-                <w:b w:val="false"/>
-                <w:bCs w:val="false"/>
-                <w:i w:val="false"/>
-                <w:iCs w:val="false"/>
-                <w:color w:val="1F2933"/>
-                <w:sz w:val="19"/>
-                <w:szCs w:val="19"/>
-              </w:rPr>
-              <w:t xml:space="preserve">Phần khách hàng </w:t>
-            </w:r>
-            <w:r>
-              <w:rPr>
-                <w:rFonts w:ascii="Calibri" w:cs="Calibri" w:eastAsia="Calibri" w:hAnsi="Calibri"/>
-                <w:b/>
-                <w:bCs/>
-                <w:i w:val="false"/>
-                <w:iCs w:val="false"/>
-                <w:color w:val="1F2933"/>
-                <w:sz w:val="19"/>
-                <w:szCs w:val="19"/>
-              </w:rPr>
-              <w:t xml:space="preserve">còn</w:t>
-            </w:r>
-            <w:r>
-              <w:rPr>
-                <w:rFonts w:ascii="Calibri" w:cs="Calibri" w:eastAsia="Calibri" w:hAnsi="Calibri"/>
-                <w:b w:val="false"/>
-                <w:bCs w:val="false"/>
-                <w:i w:val="false"/>
-                <w:iCs w:val="false"/>
-                <w:color w:val="1F2933"/>
-                <w:sz w:val="19"/>
-                <w:szCs w:val="19"/>
-              </w:rPr>
-              <w:t xml:space="preserve"> phải trả, không tính phần đã thu</w:t>
-            </w:r>
-          </w:p>
-        </w:tc>
-      </w:tr>
-      <w:tr>
-        <w:trPr>
-          <w:cantSplit/>
-        </w:trPr>
-        <w:tc>
-          <w:tcPr>
-            <w:tcW w:type="dxa" w:w="3692"/>
-            <w:tcMar>
-              <w:top w:type="dxa" w:w="60"/>
-              <w:left w:type="dxa" w:w="90"/>
-              <w:bottom w:type="dxa" w:w="60"/>
-              <w:right w:type="dxa" w:w="90"/>
-            </w:tcMar>
-          </w:tcPr>
-          <w:p>
-            <w:pPr>
-              <w:spacing w:after="0" w:line="252"/>
-            </w:pPr>
-            <w:r>
-              <w:rPr>
-                <w:rFonts w:ascii="Calibri" w:cs="Calibri" w:eastAsia="Calibri" w:hAnsi="Calibri"/>
-                <w:b/>
-                <w:bCs/>
-                <w:i w:val="false"/>
-                <w:iCs w:val="false"/>
-                <w:color w:val="1F2933"/>
-                <w:sz w:val="19"/>
-                <w:szCs w:val="19"/>
-              </w:rPr>
-              <w:t xml:space="preserve">Giàn giáo đang cho thuê</w:t>
-            </w:r>
-          </w:p>
-        </w:tc>
-        <w:tc>
-          <w:tcPr>
-            <w:tcW w:type="dxa" w:w="5946"/>
-            <w:tcMar>
-              <w:top w:type="dxa" w:w="60"/>
-              <w:left w:type="dxa" w:w="90"/>
-              <w:bottom w:type="dxa" w:w="60"/>
-              <w:right w:type="dxa" w:w="90"/>
-            </w:tcMar>
-          </w:tcPr>
-          <w:p>
-            <w:pPr>
-              <w:spacing w:after="0" w:line="252"/>
-            </w:pPr>
-            <w:r>
-              <w:rPr>
-                <w:rFonts w:ascii="Calibri" w:cs="Calibri" w:eastAsia="Calibri" w:hAnsi="Calibri"/>
-                <w:b w:val="false"/>
-                <w:bCs w:val="false"/>
-                <w:i w:val="false"/>
-                <w:iCs w:val="false"/>
-                <w:color w:val="1F2933"/>
-                <w:sz w:val="19"/>
-                <w:szCs w:val="19"/>
-              </w:rPr>
-              <w:t xml:space="preserve">Số hợp đồng cho thuê chưa thu hồi xong</w:t>
-            </w:r>
-          </w:p>
-        </w:tc>
-      </w:tr>
-      <w:tr>
-        <w:trPr>
-          <w:cantSplit/>
-        </w:trPr>
-        <w:tc>
-          <w:tcPr>
-            <w:tcW w:type="dxa" w:w="3692"/>
-            <w:tcMar>
-              <w:top w:type="dxa" w:w="60"/>
-              <w:left w:type="dxa" w:w="90"/>
-              <w:bottom w:type="dxa" w:w="60"/>
-              <w:right w:type="dxa" w:w="90"/>
-            </w:tcMar>
-          </w:tcPr>
-          <w:p>
-            <w:pPr>
-              <w:spacing w:after="0" w:line="252"/>
-            </w:pPr>
-            <w:r>
-              <w:rPr>
-                <w:rFonts w:ascii="Calibri" w:cs="Calibri" w:eastAsia="Calibri" w:hAnsi="Calibri"/>
-                <w:b/>
-                <w:bCs/>
-                <w:i w:val="false"/>
-                <w:iCs w:val="false"/>
-                <w:color w:val="1F2933"/>
-                <w:sz w:val="19"/>
-                <w:szCs w:val="19"/>
-              </w:rPr>
-              <w:t xml:space="preserve">Chấm công đã chốt</w:t>
-            </w:r>
-          </w:p>
-        </w:tc>
-        <w:tc>
-          <w:tcPr>
-            <w:tcW w:type="dxa" w:w="5946"/>
-            <w:tcMar>
-              <w:top w:type="dxa" w:w="60"/>
-              <w:left w:type="dxa" w:w="90"/>
-              <w:bottom w:type="dxa" w:w="60"/>
-              <w:right w:type="dxa" w:w="90"/>
-            </w:tcMar>
-          </w:tcPr>
-          <w:p>
-            <w:pPr>
-              <w:spacing w:after="0" w:line="252"/>
-            </w:pPr>
-            <w:r>
-              <w:rPr>
-                <w:rFonts w:ascii="Calibri" w:cs="Calibri" w:eastAsia="Calibri" w:hAnsi="Calibri"/>
-                <w:b w:val="false"/>
-                <w:bCs w:val="false"/>
-                <w:i w:val="false"/>
-                <w:iCs w:val="false"/>
-                <w:color w:val="1F2933"/>
-                <w:sz w:val="19"/>
-                <w:szCs w:val="19"/>
-              </w:rPr>
-              <w:t xml:space="preserve">Bảng công tháng đã chuyển sang Kế toán hay chưa</w:t>
-            </w:r>
-          </w:p>
-        </w:tc>
-      </w:tr>
-      <w:tr>
-        <w:trPr>
-          <w:cantSplit/>
-        </w:trPr>
-        <w:tc>
-          <w:tcPr>
-            <w:tcW w:type="dxa" w:w="3692"/>
-            <w:tcMar>
-              <w:top w:type="dxa" w:w="60"/>
-              <w:left w:type="dxa" w:w="90"/>
-              <w:bottom w:type="dxa" w:w="60"/>
-              <w:right w:type="dxa" w:w="90"/>
-            </w:tcMar>
-          </w:tcPr>
-          <w:p>
-            <w:pPr>
-              <w:spacing w:after="0" w:line="252"/>
-            </w:pPr>
-            <w:r>
-              <w:rPr>
-                <w:rFonts w:ascii="Calibri" w:cs="Calibri" w:eastAsia="Calibri" w:hAnsi="Calibri"/>
-                <w:b/>
-                <w:bCs/>
-                <w:i w:val="false"/>
-                <w:iCs w:val="false"/>
-                <w:color w:val="1F2933"/>
-                <w:sz w:val="19"/>
-                <w:szCs w:val="19"/>
-              </w:rPr>
-              <w:t xml:space="preserve">Cơ hội kinh doanh · Gói thầu · Dự án thiết kế · Hợp đồng</w:t>
-            </w:r>
-          </w:p>
-        </w:tc>
-        <w:tc>
-          <w:tcPr>
-            <w:tcW w:type="dxa" w:w="5946"/>
-            <w:tcMar>
-              <w:top w:type="dxa" w:w="60"/>
-              <w:left w:type="dxa" w:w="90"/>
-              <w:bottom w:type="dxa" w:w="60"/>
-              <w:right w:type="dxa" w:w="90"/>
-            </w:tcMar>
-          </w:tcPr>
-          <w:p>
-            <w:pPr>
-              <w:spacing w:after="0" w:line="252"/>
-            </w:pPr>
-            <w:r>
-              <w:rPr>
-                <w:rFonts w:ascii="Calibri" w:cs="Calibri" w:eastAsia="Calibri" w:hAnsi="Calibri"/>
-                <w:b w:val="false"/>
-                <w:bCs w:val="false"/>
-                <w:i w:val="false"/>
-                <w:iCs w:val="false"/>
-                <w:color w:val="1F2933"/>
-                <w:sz w:val="19"/>
-                <w:szCs w:val="19"/>
-              </w:rPr>
-              <w:t xml:space="preserve">Hồ sơ lập trong kỳ, theo trạng thái; giá trị đang theo đuổi và đã ký</w:t>
-            </w:r>
-          </w:p>
-        </w:tc>
-      </w:tr>
-    </w:tbl>
-    <w:p>
-      <w:pPr>
-        <w:spacing w:after="160"/>
-      </w:pPr>
+        <w:t xml:space="preserve">Hình 1 — Dashboard của Tổng Giám đốc: bốn ô chỉ số và hai biểu đồ theo kỳ.</w:t>
+      </w:r>
+    </w:p>
+    <w:p>
+      <w:pPr>
+        <w:spacing w:after="140" w:line="276"/>
+        <w:jc w:val="left"/>
+      </w:pPr>
+      <w:r>
+        <w:rPr>
+          <w:rFonts w:ascii="Calibri" w:cs="Calibri" w:eastAsia="Calibri" w:hAnsi="Calibri"/>
+          <w:b/>
+          <w:bCs/>
+          <w:i w:val="false"/>
+          <w:iCs w:val="false"/>
+          <w:color w:val="1F2933"/>
+          <w:sz w:val="21"/>
+          <w:szCs w:val="21"/>
+        </w:rPr>
+        <w:t xml:space="preserve">Phần dưới — các thẻ vận hành.</w:t>
+      </w:r>
+      <w:r>
+        <w:rPr>
+          <w:rFonts w:ascii="Calibri" w:cs="Calibri" w:eastAsia="Calibri" w:hAnsi="Calibri"/>
+          <w:b w:val="false"/>
+          <w:bCs w:val="false"/>
+          <w:i w:val="false"/>
+          <w:iCs w:val="false"/>
+          <w:color w:val="1F2933"/>
+          <w:sz w:val="21"/>
+          <w:szCs w:val="21"/>
+        </w:rPr>
+        <w:t xml:space="preserve"> Bấm vào thẻ để mở danh sách đã lọc sẵn.</w:t>
+      </w:r>
     </w:p>
     <w:p>
       <w:pPr>
@@ -2397,8 +2139,588 @@
           <w:sz w:val="18"/>
           <w:szCs w:val="18"/>
         </w:rPr>
-        <w:t xml:space="preserve">Hình 2 — Phần dưới Dashboard: cơ hội, gói thầu, dự án thiết kế, hợp đồng trong kỳ.</w:t>
-      </w:r>
+        <w:t xml:space="preserve">Hình 2 — Các thẻ vận hành: chờ duyệt, quá hạn, dòng tiền dự kiến, công nợ, giàn giáo, chấm công, cơ hội.</w:t>
+      </w:r>
+    </w:p>
+    <w:tbl>
+      <w:tblPr>
+        <w:tblW w:type="dxa" w:w="9638"/>
+        <w:tblBorders>
+          <w:top w:val="single" w:color="C9D2CE" w:sz="4"/>
+          <w:left w:val="single" w:color="C9D2CE" w:sz="4"/>
+          <w:bottom w:val="single" w:color="C9D2CE" w:sz="4"/>
+          <w:right w:val="single" w:color="C9D2CE" w:sz="4"/>
+          <w:insideH w:val="single" w:color="C9D2CE" w:sz="4"/>
+          <w:insideV w:val="single" w:color="C9D2CE" w:sz="4"/>
+        </w:tblBorders>
+      </w:tblPr>
+      <w:tblGrid>
+        <w:gridCol w:w="3593"/>
+        <w:gridCol w:w="6045"/>
+      </w:tblGrid>
+      <w:tr>
+        <w:trPr>
+          <w:tblHeader/>
+        </w:trPr>
+        <w:tc>
+          <w:tcPr>
+            <w:tcW w:type="dxa" w:w="3593"/>
+            <w:shd w:fill="EAF1EE" w:color="auto" w:val="clear"/>
+            <w:tcMar>
+              <w:top w:type="dxa" w:w="60"/>
+              <w:left w:type="dxa" w:w="90"/>
+              <w:bottom w:type="dxa" w:w="60"/>
+              <w:right w:type="dxa" w:w="90"/>
+            </w:tcMar>
+          </w:tcPr>
+          <w:p>
+            <w:pPr>
+              <w:spacing w:after="0" w:line="252"/>
+            </w:pPr>
+            <w:r>
+              <w:rPr>
+                <w:rFonts w:ascii="Calibri" w:cs="Calibri" w:eastAsia="Calibri" w:hAnsi="Calibri"/>
+                <w:b/>
+                <w:bCs/>
+                <w:i w:val="false"/>
+                <w:iCs w:val="false"/>
+                <w:color w:val="1F2933"/>
+                <w:sz w:val="19"/>
+                <w:szCs w:val="19"/>
+              </w:rPr>
+              <w:t xml:space="preserve">Thẻ</w:t>
+            </w:r>
+          </w:p>
+        </w:tc>
+        <w:tc>
+          <w:tcPr>
+            <w:tcW w:type="dxa" w:w="6045"/>
+            <w:shd w:fill="EAF1EE" w:color="auto" w:val="clear"/>
+            <w:tcMar>
+              <w:top w:type="dxa" w:w="60"/>
+              <w:left w:type="dxa" w:w="90"/>
+              <w:bottom w:type="dxa" w:w="60"/>
+              <w:right w:type="dxa" w:w="90"/>
+            </w:tcMar>
+          </w:tcPr>
+          <w:p>
+            <w:pPr>
+              <w:spacing w:after="0" w:line="252"/>
+            </w:pPr>
+            <w:r>
+              <w:rPr>
+                <w:rFonts w:ascii="Calibri" w:cs="Calibri" w:eastAsia="Calibri" w:hAnsi="Calibri"/>
+                <w:b/>
+                <w:bCs/>
+                <w:i w:val="false"/>
+                <w:iCs w:val="false"/>
+                <w:color w:val="1F2933"/>
+                <w:sz w:val="19"/>
+                <w:szCs w:val="19"/>
+              </w:rPr>
+              <w:t xml:space="preserve">Cho biết</w:t>
+            </w:r>
+          </w:p>
+        </w:tc>
+      </w:tr>
+      <w:tr>
+        <w:trPr>
+          <w:cantSplit/>
+        </w:trPr>
+        <w:tc>
+          <w:tcPr>
+            <w:tcW w:type="dxa" w:w="3593"/>
+            <w:tcMar>
+              <w:top w:type="dxa" w:w="60"/>
+              <w:left w:type="dxa" w:w="90"/>
+              <w:bottom w:type="dxa" w:w="60"/>
+              <w:right w:type="dxa" w:w="90"/>
+            </w:tcMar>
+          </w:tcPr>
+          <w:p>
+            <w:pPr>
+              <w:spacing w:after="0" w:line="252"/>
+            </w:pPr>
+            <w:r>
+              <w:rPr>
+                <w:rFonts w:ascii="Calibri" w:cs="Calibri" w:eastAsia="Calibri" w:hAnsi="Calibri"/>
+                <w:b/>
+                <w:bCs/>
+                <w:i w:val="false"/>
+                <w:iCs w:val="false"/>
+                <w:color w:val="1F2933"/>
+                <w:sz w:val="19"/>
+                <w:szCs w:val="19"/>
+              </w:rPr>
+              <w:t xml:space="preserve">Chờ phê duyệt</w:t>
+            </w:r>
+          </w:p>
+        </w:tc>
+        <w:tc>
+          <w:tcPr>
+            <w:tcW w:type="dxa" w:w="6045"/>
+            <w:tcMar>
+              <w:top w:type="dxa" w:w="60"/>
+              <w:left w:type="dxa" w:w="90"/>
+              <w:bottom w:type="dxa" w:w="60"/>
+              <w:right w:type="dxa" w:w="90"/>
+            </w:tcMar>
+          </w:tcPr>
+          <w:p>
+            <w:pPr>
+              <w:spacing w:after="0" w:line="252"/>
+            </w:pPr>
+            <w:r>
+              <w:rPr>
+                <w:rFonts w:ascii="Calibri" w:cs="Calibri" w:eastAsia="Calibri" w:hAnsi="Calibri"/>
+                <w:b w:val="false"/>
+                <w:bCs w:val="false"/>
+                <w:i w:val="false"/>
+                <w:iCs w:val="false"/>
+                <w:color w:val="1F2933"/>
+                <w:sz w:val="19"/>
+                <w:szCs w:val="19"/>
+              </w:rPr>
+              <w:t xml:space="preserve">Số hồ sơ nằm trong hạn mức của vai trò đang chờ duyệt, và tổng giá trị</w:t>
+            </w:r>
+          </w:p>
+        </w:tc>
+      </w:tr>
+      <w:tr>
+        <w:trPr>
+          <w:cantSplit/>
+        </w:trPr>
+        <w:tc>
+          <w:tcPr>
+            <w:tcW w:type="dxa" w:w="3593"/>
+            <w:tcMar>
+              <w:top w:type="dxa" w:w="60"/>
+              <w:left w:type="dxa" w:w="90"/>
+              <w:bottom w:type="dxa" w:w="60"/>
+              <w:right w:type="dxa" w:w="90"/>
+            </w:tcMar>
+          </w:tcPr>
+          <w:p>
+            <w:pPr>
+              <w:spacing w:after="0" w:line="252"/>
+            </w:pPr>
+            <w:r>
+              <w:rPr>
+                <w:rFonts w:ascii="Calibri" w:cs="Calibri" w:eastAsia="Calibri" w:hAnsi="Calibri"/>
+                <w:b/>
+                <w:bCs/>
+                <w:i w:val="false"/>
+                <w:iCs w:val="false"/>
+                <w:color w:val="1F2933"/>
+                <w:sz w:val="19"/>
+                <w:szCs w:val="19"/>
+              </w:rPr>
+              <w:t xml:space="preserve">Quá hạn</w:t>
+            </w:r>
+          </w:p>
+        </w:tc>
+        <w:tc>
+          <w:tcPr>
+            <w:tcW w:type="dxa" w:w="6045"/>
+            <w:tcMar>
+              <w:top w:type="dxa" w:w="60"/>
+              <w:left w:type="dxa" w:w="90"/>
+              <w:bottom w:type="dxa" w:w="60"/>
+              <w:right w:type="dxa" w:w="90"/>
+            </w:tcMar>
+          </w:tcPr>
+          <w:p>
+            <w:pPr>
+              <w:spacing w:after="0" w:line="252"/>
+            </w:pPr>
+            <w:r>
+              <w:rPr>
+                <w:rFonts w:ascii="Calibri" w:cs="Calibri" w:eastAsia="Calibri" w:hAnsi="Calibri"/>
+                <w:b w:val="false"/>
+                <w:bCs w:val="false"/>
+                <w:i w:val="false"/>
+                <w:iCs w:val="false"/>
+                <w:color w:val="1F2933"/>
+                <w:sz w:val="19"/>
+                <w:szCs w:val="19"/>
+              </w:rPr>
+              <w:t xml:space="preserve">Hồ sơ vượt thời hạn xử lý, công nợ quá hạn thu, phê duyệt bị để lâu — gộp mọi phân hệ</w:t>
+            </w:r>
+          </w:p>
+        </w:tc>
+      </w:tr>
+      <w:tr>
+        <w:trPr>
+          <w:cantSplit/>
+        </w:trPr>
+        <w:tc>
+          <w:tcPr>
+            <w:tcW w:type="dxa" w:w="3593"/>
+            <w:tcMar>
+              <w:top w:type="dxa" w:w="60"/>
+              <w:left w:type="dxa" w:w="90"/>
+              <w:bottom w:type="dxa" w:w="60"/>
+              <w:right w:type="dxa" w:w="90"/>
+            </w:tcMar>
+          </w:tcPr>
+          <w:p>
+            <w:pPr>
+              <w:spacing w:after="0" w:line="252"/>
+            </w:pPr>
+            <w:r>
+              <w:rPr>
+                <w:rFonts w:ascii="Calibri" w:cs="Calibri" w:eastAsia="Calibri" w:hAnsi="Calibri"/>
+                <w:b/>
+                <w:bCs/>
+                <w:i w:val="false"/>
+                <w:iCs w:val="false"/>
+                <w:color w:val="1F2933"/>
+                <w:sz w:val="19"/>
+                <w:szCs w:val="19"/>
+              </w:rPr>
+              <w:t xml:space="preserve">Dòng tiền</w:t>
+            </w:r>
+          </w:p>
+        </w:tc>
+        <w:tc>
+          <w:tcPr>
+            <w:tcW w:type="dxa" w:w="6045"/>
+            <w:tcMar>
+              <w:top w:type="dxa" w:w="60"/>
+              <w:left w:type="dxa" w:w="90"/>
+              <w:bottom w:type="dxa" w:w="60"/>
+              <w:right w:type="dxa" w:w="90"/>
+            </w:tcMar>
+          </w:tcPr>
+          <w:p>
+            <w:pPr>
+              <w:spacing w:after="0" w:line="252"/>
+            </w:pPr>
+            <w:r>
+              <w:rPr>
+                <w:rFonts w:ascii="Calibri" w:cs="Calibri" w:eastAsia="Calibri" w:hAnsi="Calibri"/>
+                <w:b w:val="false"/>
+                <w:bCs w:val="false"/>
+                <w:i w:val="false"/>
+                <w:iCs w:val="false"/>
+                <w:color w:val="1F2933"/>
+                <w:sz w:val="19"/>
+                <w:szCs w:val="19"/>
+              </w:rPr>
+              <w:t xml:space="preserve">Số dư cuối kỳ </w:t>
+            </w:r>
+            <w:r>
+              <w:rPr>
+                <w:rFonts w:ascii="Calibri" w:cs="Calibri" w:eastAsia="Calibri" w:hAnsi="Calibri"/>
+                <w:b/>
+                <w:bCs/>
+                <w:i w:val="false"/>
+                <w:iCs w:val="false"/>
+                <w:color w:val="1F2933"/>
+                <w:sz w:val="19"/>
+                <w:szCs w:val="19"/>
+              </w:rPr>
+              <w:t xml:space="preserve">dự kiến</w:t>
+            </w:r>
+            <w:r>
+              <w:rPr>
+                <w:rFonts w:ascii="Calibri" w:cs="Calibri" w:eastAsia="Calibri" w:hAnsi="Calibri"/>
+                <w:b w:val="false"/>
+                <w:bCs w:val="false"/>
+                <w:i w:val="false"/>
+                <w:iCs w:val="false"/>
+                <w:color w:val="1F2933"/>
+                <w:sz w:val="19"/>
+                <w:szCs w:val="19"/>
+              </w:rPr>
+              <w:t xml:space="preserve">: số dư đầu kỳ Kế toán đã lập, cộng thu, trừ chi, trừ khoản đã duyệt chưa chi</w:t>
+            </w:r>
+          </w:p>
+        </w:tc>
+      </w:tr>
+      <w:tr>
+        <w:trPr>
+          <w:cantSplit/>
+        </w:trPr>
+        <w:tc>
+          <w:tcPr>
+            <w:tcW w:type="dxa" w:w="3593"/>
+            <w:tcMar>
+              <w:top w:type="dxa" w:w="60"/>
+              <w:left w:type="dxa" w:w="90"/>
+              <w:bottom w:type="dxa" w:w="60"/>
+              <w:right w:type="dxa" w:w="90"/>
+            </w:tcMar>
+          </w:tcPr>
+          <w:p>
+            <w:pPr>
+              <w:spacing w:after="0" w:line="252"/>
+            </w:pPr>
+            <w:r>
+              <w:rPr>
+                <w:rFonts w:ascii="Calibri" w:cs="Calibri" w:eastAsia="Calibri" w:hAnsi="Calibri"/>
+                <w:b/>
+                <w:bCs/>
+                <w:i w:val="false"/>
+                <w:iCs w:val="false"/>
+                <w:color w:val="1F2933"/>
+                <w:sz w:val="19"/>
+                <w:szCs w:val="19"/>
+              </w:rPr>
+              <w:t xml:space="preserve">Công nợ phải thu</w:t>
+            </w:r>
+          </w:p>
+        </w:tc>
+        <w:tc>
+          <w:tcPr>
+            <w:tcW w:type="dxa" w:w="6045"/>
+            <w:tcMar>
+              <w:top w:type="dxa" w:w="60"/>
+              <w:left w:type="dxa" w:w="90"/>
+              <w:bottom w:type="dxa" w:w="60"/>
+              <w:right w:type="dxa" w:w="90"/>
+            </w:tcMar>
+          </w:tcPr>
+          <w:p>
+            <w:pPr>
+              <w:spacing w:after="0" w:line="252"/>
+            </w:pPr>
+            <w:r>
+              <w:rPr>
+                <w:rFonts w:ascii="Calibri" w:cs="Calibri" w:eastAsia="Calibri" w:hAnsi="Calibri"/>
+                <w:b w:val="false"/>
+                <w:bCs w:val="false"/>
+                <w:i w:val="false"/>
+                <w:iCs w:val="false"/>
+                <w:color w:val="1F2933"/>
+                <w:sz w:val="19"/>
+                <w:szCs w:val="19"/>
+              </w:rPr>
+              <w:t xml:space="preserve">Phần khách hàng </w:t>
+            </w:r>
+            <w:r>
+              <w:rPr>
+                <w:rFonts w:ascii="Calibri" w:cs="Calibri" w:eastAsia="Calibri" w:hAnsi="Calibri"/>
+                <w:b/>
+                <w:bCs/>
+                <w:i w:val="false"/>
+                <w:iCs w:val="false"/>
+                <w:color w:val="1F2933"/>
+                <w:sz w:val="19"/>
+                <w:szCs w:val="19"/>
+              </w:rPr>
+              <w:t xml:space="preserve">còn</w:t>
+            </w:r>
+            <w:r>
+              <w:rPr>
+                <w:rFonts w:ascii="Calibri" w:cs="Calibri" w:eastAsia="Calibri" w:hAnsi="Calibri"/>
+                <w:b w:val="false"/>
+                <w:bCs w:val="false"/>
+                <w:i w:val="false"/>
+                <w:iCs w:val="false"/>
+                <w:color w:val="1F2933"/>
+                <w:sz w:val="19"/>
+                <w:szCs w:val="19"/>
+              </w:rPr>
+              <w:t xml:space="preserve"> phải trả, không tính phần đã thu</w:t>
+            </w:r>
+          </w:p>
+        </w:tc>
+      </w:tr>
+      <w:tr>
+        <w:trPr>
+          <w:cantSplit/>
+        </w:trPr>
+        <w:tc>
+          <w:tcPr>
+            <w:tcW w:type="dxa" w:w="3593"/>
+            <w:tcMar>
+              <w:top w:type="dxa" w:w="60"/>
+              <w:left w:type="dxa" w:w="90"/>
+              <w:bottom w:type="dxa" w:w="60"/>
+              <w:right w:type="dxa" w:w="90"/>
+            </w:tcMar>
+          </w:tcPr>
+          <w:p>
+            <w:pPr>
+              <w:spacing w:after="0" w:line="252"/>
+            </w:pPr>
+            <w:r>
+              <w:rPr>
+                <w:rFonts w:ascii="Calibri" w:cs="Calibri" w:eastAsia="Calibri" w:hAnsi="Calibri"/>
+                <w:b/>
+                <w:bCs/>
+                <w:i w:val="false"/>
+                <w:iCs w:val="false"/>
+                <w:color w:val="1F2933"/>
+                <w:sz w:val="19"/>
+                <w:szCs w:val="19"/>
+              </w:rPr>
+              <w:t xml:space="preserve">Giàn giáo đang cho thuê</w:t>
+            </w:r>
+          </w:p>
+        </w:tc>
+        <w:tc>
+          <w:tcPr>
+            <w:tcW w:type="dxa" w:w="6045"/>
+            <w:tcMar>
+              <w:top w:type="dxa" w:w="60"/>
+              <w:left w:type="dxa" w:w="90"/>
+              <w:bottom w:type="dxa" w:w="60"/>
+              <w:right w:type="dxa" w:w="90"/>
+            </w:tcMar>
+          </w:tcPr>
+          <w:p>
+            <w:pPr>
+              <w:spacing w:after="0" w:line="252"/>
+            </w:pPr>
+            <w:r>
+              <w:rPr>
+                <w:rFonts w:ascii="Calibri" w:cs="Calibri" w:eastAsia="Calibri" w:hAnsi="Calibri"/>
+                <w:b w:val="false"/>
+                <w:bCs w:val="false"/>
+                <w:i w:val="false"/>
+                <w:iCs w:val="false"/>
+                <w:color w:val="1F2933"/>
+                <w:sz w:val="19"/>
+                <w:szCs w:val="19"/>
+              </w:rPr>
+              <w:t xml:space="preserve">Số hợp đồng cho thuê chưa thu hồi xong</w:t>
+            </w:r>
+          </w:p>
+        </w:tc>
+      </w:tr>
+      <w:tr>
+        <w:trPr>
+          <w:cantSplit/>
+        </w:trPr>
+        <w:tc>
+          <w:tcPr>
+            <w:tcW w:type="dxa" w:w="3593"/>
+            <w:tcMar>
+              <w:top w:type="dxa" w:w="60"/>
+              <w:left w:type="dxa" w:w="90"/>
+              <w:bottom w:type="dxa" w:w="60"/>
+              <w:right w:type="dxa" w:w="90"/>
+            </w:tcMar>
+          </w:tcPr>
+          <w:p>
+            <w:pPr>
+              <w:spacing w:after="0" w:line="252"/>
+            </w:pPr>
+            <w:r>
+              <w:rPr>
+                <w:rFonts w:ascii="Calibri" w:cs="Calibri" w:eastAsia="Calibri" w:hAnsi="Calibri"/>
+                <w:b/>
+                <w:bCs/>
+                <w:i w:val="false"/>
+                <w:iCs w:val="false"/>
+                <w:color w:val="1F2933"/>
+                <w:sz w:val="19"/>
+                <w:szCs w:val="19"/>
+              </w:rPr>
+              <w:t xml:space="preserve">Chấm công đã chốt</w:t>
+            </w:r>
+          </w:p>
+        </w:tc>
+        <w:tc>
+          <w:tcPr>
+            <w:tcW w:type="dxa" w:w="6045"/>
+            <w:tcMar>
+              <w:top w:type="dxa" w:w="60"/>
+              <w:left w:type="dxa" w:w="90"/>
+              <w:bottom w:type="dxa" w:w="60"/>
+              <w:right w:type="dxa" w:w="90"/>
+            </w:tcMar>
+          </w:tcPr>
+          <w:p>
+            <w:pPr>
+              <w:spacing w:after="0" w:line="252"/>
+            </w:pPr>
+            <w:r>
+              <w:rPr>
+                <w:rFonts w:ascii="Calibri" w:cs="Calibri" w:eastAsia="Calibri" w:hAnsi="Calibri"/>
+                <w:b w:val="false"/>
+                <w:bCs w:val="false"/>
+                <w:i w:val="false"/>
+                <w:iCs w:val="false"/>
+                <w:color w:val="1F2933"/>
+                <w:sz w:val="19"/>
+                <w:szCs w:val="19"/>
+              </w:rPr>
+              <w:t xml:space="preserve">Bảng công tháng đã chuyển sang Kế toán hay chưa</w:t>
+            </w:r>
+          </w:p>
+        </w:tc>
+      </w:tr>
+      <w:tr>
+        <w:trPr>
+          <w:cantSplit/>
+        </w:trPr>
+        <w:tc>
+          <w:tcPr>
+            <w:tcW w:type="dxa" w:w="3593"/>
+            <w:tcMar>
+              <w:top w:type="dxa" w:w="60"/>
+              <w:left w:type="dxa" w:w="90"/>
+              <w:bottom w:type="dxa" w:w="60"/>
+              <w:right w:type="dxa" w:w="90"/>
+            </w:tcMar>
+          </w:tcPr>
+          <w:p>
+            <w:pPr>
+              <w:spacing w:after="0" w:line="252"/>
+            </w:pPr>
+            <w:r>
+              <w:rPr>
+                <w:rFonts w:ascii="Calibri" w:cs="Calibri" w:eastAsia="Calibri" w:hAnsi="Calibri"/>
+                <w:b/>
+                <w:bCs/>
+                <w:i w:val="false"/>
+                <w:iCs w:val="false"/>
+                <w:color w:val="1F2933"/>
+                <w:sz w:val="19"/>
+                <w:szCs w:val="19"/>
+              </w:rPr>
+              <w:t xml:space="preserve">Cơ hội kinh doanh · Gói thầu · Dự án thiết kế · Hợp đồng</w:t>
+            </w:r>
+          </w:p>
+        </w:tc>
+        <w:tc>
+          <w:tcPr>
+            <w:tcW w:type="dxa" w:w="6045"/>
+            <w:tcMar>
+              <w:top w:type="dxa" w:w="60"/>
+              <w:left w:type="dxa" w:w="90"/>
+              <w:bottom w:type="dxa" w:w="60"/>
+              <w:right w:type="dxa" w:w="90"/>
+            </w:tcMar>
+          </w:tcPr>
+          <w:p>
+            <w:pPr>
+              <w:spacing w:after="0" w:line="252"/>
+            </w:pPr>
+            <w:r>
+              <w:rPr>
+                <w:rFonts w:ascii="Calibri" w:cs="Calibri" w:eastAsia="Calibri" w:hAnsi="Calibri"/>
+                <w:b w:val="false"/>
+                <w:bCs w:val="false"/>
+                <w:i w:val="false"/>
+                <w:iCs w:val="false"/>
+                <w:color w:val="1F2933"/>
+                <w:sz w:val="19"/>
+                <w:szCs w:val="19"/>
+              </w:rPr>
+              <w:t xml:space="preserve">Hồ sơ lập trong kỳ, theo trạng thái; giá trị đang theo đuổi và đã ký</w:t>
+            </w:r>
+          </w:p>
+        </w:tc>
+      </w:tr>
+    </w:tbl>
+    <w:p>
+      <w:pPr>
+        <w:spacing w:after="160"/>
+      </w:pPr>
     </w:p>
     <w:p>
       <w:pPr>
@@ -2419,7 +2741,7 @@
           <w:sz w:val="21"/>
           <w:szCs w:val="21"/>
         </w:rPr>
-        <w:t xml:space="preserve">Thẻ ghi </w:t>
+        <w:t xml:space="preserve">Chỗ ghi </w:t>
       </w:r>
       <w:r>
         <w:rPr>
@@ -2445,7 +2767,7 @@
           <w:sz w:val="21"/>
           <w:szCs w:val="21"/>
         </w:rPr>
-        <w:t xml:space="preserve"> nghĩa là nguồn số liệu chưa có — ví dụ Kế toán chưa lập kế hoạch dòng tiền cho kỳ đang xem. Hệ thống cố ý không hiện «0» trong trường hợp này: con số 0 sẽ đọc như một số liệu thật.</w:t>
+        <w:t xml:space="preserve"> nghĩa là nguồn số liệu chưa có — ví dụ Kế toán chưa lập kế hoạch dòng tiền cho kỳ đang xem, hoặc kỳ đó chưa có phát sinh. Hệ thống cố ý không hiện «0» trong trường hợp này: con số 0 sẽ đọc như một số liệu thật.</w:t>
       </w:r>
     </w:p>
     <w:p>
@@ -2871,7 +3193,7 @@
           <w:sz w:val="30"/>
           <w:szCs w:val="30"/>
         </w:rPr>
-        <w:t xml:space="preserve">5. Lãi/lỗ theo công trình</w:t>
+        <w:t xml:space="preserve">5. Tổng quan tài chính</w:t>
       </w:r>
     </w:p>
     <w:p>
@@ -2890,7 +3212,7 @@
           <w:sz w:val="21"/>
           <w:szCs w:val="21"/>
         </w:rPr>
-        <w:t xml:space="preserve">Báo cáo &amp; Dashboard → Lãi/lỗ theo công trình</w:t>
+        <w:t xml:space="preserve">Báo cáo &amp; Dashboard → Tổng quan tài chính</w:t>
       </w:r>
       <w:r>
         <w:rPr>
@@ -2903,20 +3225,128 @@
           <w:sz w:val="21"/>
           <w:szCs w:val="21"/>
         </w:rPr>
-        <w:t xml:space="preserve">, hoặc bấm thẻ </w:t>
-      </w:r>
-      <w:r>
-        <w:rPr>
-          <w:rFonts w:ascii="Calibri" w:cs="Calibri" w:eastAsia="Calibri" w:hAnsi="Calibri"/>
-          <w:b/>
-          <w:bCs/>
-          <w:i w:val="false"/>
-          <w:iCs w:val="false"/>
-          <w:color w:val="1F2933"/>
-          <w:sz w:val="21"/>
-          <w:szCs w:val="21"/>
-        </w:rPr>
-        <w:t xml:space="preserve">Lãi/lỗ theo công trình</w:t>
+        <w:t xml:space="preserve"> (hoặc «Xem đầy đủ và xuất báo cáo →» trên Dashboard): cùng các biểu đồ với Dashboard nhưng khổ lớn, cộng thêm:</w:t>
+      </w:r>
+    </w:p>
+    <w:p>
+      <w:pPr>
+        <w:pStyle w:val="ListParagraph"/>
+        <w:numPr>
+          <w:ilvl w:val="0"/>
+          <w:numId w:val="2"/>
+        </w:numPr>
+        <w:spacing w:after="70" w:line="276"/>
+      </w:pPr>
+      <w:r>
+        <w:rPr>
+          <w:rFonts w:ascii="Calibri" w:cs="Calibri" w:eastAsia="Calibri" w:hAnsi="Calibri"/>
+          <w:b/>
+          <w:bCs/>
+          <w:i w:val="false"/>
+          <w:iCs w:val="false"/>
+          <w:color w:val="1F2933"/>
+          <w:sz w:val="21"/>
+          <w:szCs w:val="21"/>
+        </w:rPr>
+        <w:t xml:space="preserve">Bảng số theo kỳ</w:t>
+      </w:r>
+      <w:r>
+        <w:rPr>
+          <w:rFonts w:ascii="Calibri" w:cs="Calibri" w:eastAsia="Calibri" w:hAnsi="Calibri"/>
+          <w:b w:val="false"/>
+          <w:bCs w:val="false"/>
+          <w:i w:val="false"/>
+          <w:iCs w:val="false"/>
+          <w:color w:val="1F2933"/>
+          <w:sz w:val="21"/>
+          <w:szCs w:val="21"/>
+        </w:rPr>
+        <w:t xml:space="preserve"> ngay dưới mỗi biểu đồ: doanh thu, hợp đồng ký mới, đã thu, đã chi, dòng tiền ròng — đọc được khi in.</w:t>
+      </w:r>
+    </w:p>
+    <w:p>
+      <w:pPr>
+        <w:pStyle w:val="ListParagraph"/>
+        <w:numPr>
+          <w:ilvl w:val="0"/>
+          <w:numId w:val="2"/>
+        </w:numPr>
+        <w:spacing w:after="70" w:line="276"/>
+      </w:pPr>
+      <w:r>
+        <w:rPr>
+          <w:rFonts w:ascii="Calibri" w:cs="Calibri" w:eastAsia="Calibri" w:hAnsi="Calibri"/>
+          <w:b/>
+          <w:bCs/>
+          <w:i w:val="false"/>
+          <w:iCs w:val="false"/>
+          <w:color w:val="1F2933"/>
+          <w:sz w:val="21"/>
+          <w:szCs w:val="21"/>
+        </w:rPr>
+        <w:t xml:space="preserve">Theo pháp nhân</w:t>
+      </w:r>
+      <w:r>
+        <w:rPr>
+          <w:rFonts w:ascii="Calibri" w:cs="Calibri" w:eastAsia="Calibri" w:hAnsi="Calibri"/>
+          <w:b w:val="false"/>
+          <w:bCs w:val="false"/>
+          <w:i w:val="false"/>
+          <w:iCs w:val="false"/>
+          <w:color w:val="1F2933"/>
+          <w:sz w:val="21"/>
+          <w:szCs w:val="21"/>
+        </w:rPr>
+        <w:t xml:space="preserve"> khi đang xem Toàn NVG.</w:t>
+      </w:r>
+    </w:p>
+    <w:p>
+      <w:pPr>
+        <w:pStyle w:val="ListParagraph"/>
+        <w:numPr>
+          <w:ilvl w:val="0"/>
+          <w:numId w:val="2"/>
+        </w:numPr>
+        <w:spacing w:after="70" w:line="276"/>
+      </w:pPr>
+      <w:r>
+        <w:rPr>
+          <w:rFonts w:ascii="Calibri" w:cs="Calibri" w:eastAsia="Calibri" w:hAnsi="Calibri"/>
+          <w:b/>
+          <w:bCs/>
+          <w:i w:val="false"/>
+          <w:iCs w:val="false"/>
+          <w:color w:val="1F2933"/>
+          <w:sz w:val="21"/>
+          <w:szCs w:val="21"/>
+        </w:rPr>
+        <w:t xml:space="preserve">Xuất Excel</w:t>
+      </w:r>
+      <w:r>
+        <w:rPr>
+          <w:rFonts w:ascii="Calibri" w:cs="Calibri" w:eastAsia="Calibri" w:hAnsi="Calibri"/>
+          <w:b w:val="false"/>
+          <w:bCs w:val="false"/>
+          <w:i w:val="false"/>
+          <w:iCs w:val="false"/>
+          <w:color w:val="1F2933"/>
+          <w:sz w:val="21"/>
+          <w:szCs w:val="21"/>
+        </w:rPr>
+        <w:t xml:space="preserve"> (số theo tháng) và </w:t>
+      </w:r>
+      <w:r>
+        <w:rPr>
+          <w:rFonts w:ascii="Calibri" w:cs="Calibri" w:eastAsia="Calibri" w:hAnsi="Calibri"/>
+          <w:b/>
+          <w:bCs/>
+          <w:i w:val="false"/>
+          <w:iCs w:val="false"/>
+          <w:color w:val="1F2933"/>
+          <w:sz w:val="21"/>
+          <w:szCs w:val="21"/>
+        </w:rPr>
+        <w:t xml:space="preserve">Xuất PDF</w:t>
       </w:r>
       <w:r>
         <w:rPr>
@@ -2993,556 +3423,7 @@
           <w:sz w:val="18"/>
           <w:szCs w:val="18"/>
         </w:rPr>
-        <w:t xml:space="preserve">Hình 4 — Báo cáo lãi/lỗ theo công trình.</w:t>
-      </w:r>
-    </w:p>
-    <w:tbl>
-      <w:tblPr>
-        <w:tblW w:type="dxa" w:w="9638"/>
-        <w:tblBorders>
-          <w:top w:val="single" w:color="C9D2CE" w:sz="4"/>
-          <w:left w:val="single" w:color="C9D2CE" w:sz="4"/>
-          <w:bottom w:val="single" w:color="C9D2CE" w:sz="4"/>
-          <w:right w:val="single" w:color="C9D2CE" w:sz="4"/>
-          <w:insideH w:val="single" w:color="C9D2CE" w:sz="4"/>
-          <w:insideV w:val="single" w:color="C9D2CE" w:sz="4"/>
-        </w:tblBorders>
-      </w:tblPr>
-      <w:tblGrid>
-        <w:gridCol w:w="3215"/>
-        <w:gridCol w:w="6423"/>
-      </w:tblGrid>
-      <w:tr>
-        <w:trPr>
-          <w:tblHeader/>
-        </w:trPr>
-        <w:tc>
-          <w:tcPr>
-            <w:tcW w:type="dxa" w:w="3215"/>
-            <w:shd w:fill="EAF1EE" w:color="auto" w:val="clear"/>
-            <w:tcMar>
-              <w:top w:type="dxa" w:w="60"/>
-              <w:left w:type="dxa" w:w="90"/>
-              <w:bottom w:type="dxa" w:w="60"/>
-              <w:right w:type="dxa" w:w="90"/>
-            </w:tcMar>
-          </w:tcPr>
-          <w:p>
-            <w:pPr>
-              <w:spacing w:after="0" w:line="252"/>
-            </w:pPr>
-            <w:r>
-              <w:rPr>
-                <w:rFonts w:ascii="Calibri" w:cs="Calibri" w:eastAsia="Calibri" w:hAnsi="Calibri"/>
-                <w:b/>
-                <w:bCs/>
-                <w:i w:val="false"/>
-                <w:iCs w:val="false"/>
-                <w:color w:val="1F2933"/>
-                <w:sz w:val="19"/>
-                <w:szCs w:val="19"/>
-              </w:rPr>
-              <w:t xml:space="preserve">Cột</w:t>
-            </w:r>
-          </w:p>
-        </w:tc>
-        <w:tc>
-          <w:tcPr>
-            <w:tcW w:type="dxa" w:w="6423"/>
-            <w:shd w:fill="EAF1EE" w:color="auto" w:val="clear"/>
-            <w:tcMar>
-              <w:top w:type="dxa" w:w="60"/>
-              <w:left w:type="dxa" w:w="90"/>
-              <w:bottom w:type="dxa" w:w="60"/>
-              <w:right w:type="dxa" w:w="90"/>
-            </w:tcMar>
-          </w:tcPr>
-          <w:p>
-            <w:pPr>
-              <w:spacing w:after="0" w:line="252"/>
-            </w:pPr>
-            <w:r>
-              <w:rPr>
-                <w:rFonts w:ascii="Calibri" w:cs="Calibri" w:eastAsia="Calibri" w:hAnsi="Calibri"/>
-                <w:b/>
-                <w:bCs/>
-                <w:i w:val="false"/>
-                <w:iCs w:val="false"/>
-                <w:color w:val="1F2933"/>
-                <w:sz w:val="19"/>
-                <w:szCs w:val="19"/>
-              </w:rPr>
-              <w:t xml:space="preserve">Cách tính</w:t>
-            </w:r>
-          </w:p>
-        </w:tc>
-      </w:tr>
-      <w:tr>
-        <w:trPr>
-          <w:cantSplit/>
-        </w:trPr>
-        <w:tc>
-          <w:tcPr>
-            <w:tcW w:type="dxa" w:w="3215"/>
-            <w:tcMar>
-              <w:top w:type="dxa" w:w="60"/>
-              <w:left w:type="dxa" w:w="90"/>
-              <w:bottom w:type="dxa" w:w="60"/>
-              <w:right w:type="dxa" w:w="90"/>
-            </w:tcMar>
-          </w:tcPr>
-          <w:p>
-            <w:pPr>
-              <w:spacing w:after="0" w:line="252"/>
-            </w:pPr>
-            <w:r>
-              <w:rPr>
-                <w:rFonts w:ascii="Calibri" w:cs="Calibri" w:eastAsia="Calibri" w:hAnsi="Calibri"/>
-                <w:b/>
-                <w:bCs/>
-                <w:i w:val="false"/>
-                <w:iCs w:val="false"/>
-                <w:color w:val="1F2933"/>
-                <w:sz w:val="19"/>
-                <w:szCs w:val="19"/>
-              </w:rPr>
-              <w:t xml:space="preserve">Giá trị hợp đồng</w:t>
-            </w:r>
-          </w:p>
-        </w:tc>
-        <w:tc>
-          <w:tcPr>
-            <w:tcW w:type="dxa" w:w="6423"/>
-            <w:tcMar>
-              <w:top w:type="dxa" w:w="60"/>
-              <w:left w:type="dxa" w:w="90"/>
-              <w:bottom w:type="dxa" w:w="60"/>
-              <w:right w:type="dxa" w:w="90"/>
-            </w:tcMar>
-          </w:tcPr>
-          <w:p>
-            <w:pPr>
-              <w:spacing w:after="0" w:line="252"/>
-            </w:pPr>
-            <w:r>
-              <w:rPr>
-                <w:rFonts w:ascii="Calibri" w:cs="Calibri" w:eastAsia="Calibri" w:hAnsi="Calibri"/>
-                <w:b w:val="false"/>
-                <w:bCs w:val="false"/>
-                <w:i w:val="false"/>
-                <w:iCs w:val="false"/>
-                <w:color w:val="1F2933"/>
-                <w:sz w:val="19"/>
-                <w:szCs w:val="19"/>
-              </w:rPr>
-              <w:t xml:space="preserve">Giá trị hợp đồng đã ký với chủ đầu tư</w:t>
-            </w:r>
-          </w:p>
-        </w:tc>
-      </w:tr>
-      <w:tr>
-        <w:trPr>
-          <w:cantSplit/>
-        </w:trPr>
-        <w:tc>
-          <w:tcPr>
-            <w:tcW w:type="dxa" w:w="3215"/>
-            <w:tcMar>
-              <w:top w:type="dxa" w:w="60"/>
-              <w:left w:type="dxa" w:w="90"/>
-              <w:bottom w:type="dxa" w:w="60"/>
-              <w:right w:type="dxa" w:w="90"/>
-            </w:tcMar>
-          </w:tcPr>
-          <w:p>
-            <w:pPr>
-              <w:spacing w:after="0" w:line="252"/>
-            </w:pPr>
-            <w:r>
-              <w:rPr>
-                <w:rFonts w:ascii="Calibri" w:cs="Calibri" w:eastAsia="Calibri" w:hAnsi="Calibri"/>
-                <w:b/>
-                <w:bCs/>
-                <w:i w:val="false"/>
-                <w:iCs w:val="false"/>
-                <w:color w:val="1F2933"/>
-                <w:sz w:val="19"/>
-                <w:szCs w:val="19"/>
-              </w:rPr>
-              <w:t xml:space="preserve">Đã nghiệm thu</w:t>
-            </w:r>
-          </w:p>
-        </w:tc>
-        <w:tc>
-          <w:tcPr>
-            <w:tcW w:type="dxa" w:w="6423"/>
-            <w:tcMar>
-              <w:top w:type="dxa" w:w="60"/>
-              <w:left w:type="dxa" w:w="90"/>
-              <w:bottom w:type="dxa" w:w="60"/>
-              <w:right w:type="dxa" w:w="90"/>
-            </w:tcMar>
-          </w:tcPr>
-          <w:p>
-            <w:pPr>
-              <w:spacing w:after="0" w:line="252"/>
-            </w:pPr>
-            <w:r>
-              <w:rPr>
-                <w:rFonts w:ascii="Calibri" w:cs="Calibri" w:eastAsia="Calibri" w:hAnsi="Calibri"/>
-                <w:b w:val="false"/>
-                <w:bCs w:val="false"/>
-                <w:i w:val="false"/>
-                <w:iCs w:val="false"/>
-                <w:color w:val="1F2933"/>
-                <w:sz w:val="19"/>
-                <w:szCs w:val="19"/>
-              </w:rPr>
-              <w:t xml:space="preserve">Tổng giá trị các biên bản nghiệm thu </w:t>
-            </w:r>
-            <w:r>
-              <w:rPr>
-                <w:rFonts w:ascii="Calibri" w:cs="Calibri" w:eastAsia="Calibri" w:hAnsi="Calibri"/>
-                <w:b/>
-                <w:bCs/>
-                <w:i w:val="false"/>
-                <w:iCs w:val="false"/>
-                <w:color w:val="1F2933"/>
-                <w:sz w:val="19"/>
-                <w:szCs w:val="19"/>
-              </w:rPr>
-              <w:t xml:space="preserve">với chủ đầu tư</w:t>
-            </w:r>
-            <w:r>
-              <w:rPr>
-                <w:rFonts w:ascii="Calibri" w:cs="Calibri" w:eastAsia="Calibri" w:hAnsi="Calibri"/>
-                <w:b w:val="false"/>
-                <w:bCs w:val="false"/>
-                <w:i w:val="false"/>
-                <w:iCs w:val="false"/>
-                <w:color w:val="1F2933"/>
-                <w:sz w:val="19"/>
-                <w:szCs w:val="19"/>
-              </w:rPr>
-              <w:t xml:space="preserve"> — căn cứ ghi doanh thu</w:t>
-            </w:r>
-          </w:p>
-        </w:tc>
-      </w:tr>
-      <w:tr>
-        <w:trPr>
-          <w:cantSplit/>
-        </w:trPr>
-        <w:tc>
-          <w:tcPr>
-            <w:tcW w:type="dxa" w:w="3215"/>
-            <w:tcMar>
-              <w:top w:type="dxa" w:w="60"/>
-              <w:left w:type="dxa" w:w="90"/>
-              <w:bottom w:type="dxa" w:w="60"/>
-              <w:right w:type="dxa" w:w="90"/>
-            </w:tcMar>
-          </w:tcPr>
-          <w:p>
-            <w:pPr>
-              <w:spacing w:after="0" w:line="252"/>
-            </w:pPr>
-            <w:r>
-              <w:rPr>
-                <w:rFonts w:ascii="Calibri" w:cs="Calibri" w:eastAsia="Calibri" w:hAnsi="Calibri"/>
-                <w:b/>
-                <w:bCs/>
-                <w:i w:val="false"/>
-                <w:iCs w:val="false"/>
-                <w:color w:val="1F2933"/>
-                <w:sz w:val="19"/>
-                <w:szCs w:val="19"/>
-              </w:rPr>
-              <w:t xml:space="preserve">Giá vốn thực tế</w:t>
-            </w:r>
-          </w:p>
-        </w:tc>
-        <w:tc>
-          <w:tcPr>
-            <w:tcW w:type="dxa" w:w="6423"/>
-            <w:tcMar>
-              <w:top w:type="dxa" w:w="60"/>
-              <w:left w:type="dxa" w:w="90"/>
-              <w:bottom w:type="dxa" w:w="60"/>
-              <w:right w:type="dxa" w:w="90"/>
-            </w:tcMar>
-          </w:tcPr>
-          <w:p>
-            <w:pPr>
-              <w:spacing w:after="0" w:line="252"/>
-            </w:pPr>
-            <w:r>
-              <w:rPr>
-                <w:rFonts w:ascii="Calibri" w:cs="Calibri" w:eastAsia="Calibri" w:hAnsi="Calibri"/>
-                <w:b w:val="false"/>
-                <w:bCs w:val="false"/>
-                <w:i w:val="false"/>
-                <w:iCs w:val="false"/>
-                <w:color w:val="1F2933"/>
-                <w:sz w:val="19"/>
-                <w:szCs w:val="19"/>
-              </w:rPr>
-              <w:t xml:space="preserve">Chi phí đã phát sinh tới hôm nay, cộng từ phiếu xuất kho, đơn hàng, đề nghị thanh toán đã chi</w:t>
-            </w:r>
-          </w:p>
-        </w:tc>
-      </w:tr>
-      <w:tr>
-        <w:trPr>
-          <w:cantSplit/>
-        </w:trPr>
-        <w:tc>
-          <w:tcPr>
-            <w:tcW w:type="dxa" w:w="3215"/>
-            <w:tcMar>
-              <w:top w:type="dxa" w:w="60"/>
-              <w:left w:type="dxa" w:w="90"/>
-              <w:bottom w:type="dxa" w:w="60"/>
-              <w:right w:type="dxa" w:w="90"/>
-            </w:tcMar>
-          </w:tcPr>
-          <w:p>
-            <w:pPr>
-              <w:spacing w:after="0" w:line="252"/>
-            </w:pPr>
-            <w:r>
-              <w:rPr>
-                <w:rFonts w:ascii="Calibri" w:cs="Calibri" w:eastAsia="Calibri" w:hAnsi="Calibri"/>
-                <w:b/>
-                <w:bCs/>
-                <w:i w:val="false"/>
-                <w:iCs w:val="false"/>
-                <w:color w:val="1F2933"/>
-                <w:sz w:val="19"/>
-                <w:szCs w:val="19"/>
-              </w:rPr>
-              <w:t xml:space="preserve">Đã cam kết</w:t>
-            </w:r>
-          </w:p>
-        </w:tc>
-        <w:tc>
-          <w:tcPr>
-            <w:tcW w:type="dxa" w:w="6423"/>
-            <w:tcMar>
-              <w:top w:type="dxa" w:w="60"/>
-              <w:left w:type="dxa" w:w="90"/>
-              <w:bottom w:type="dxa" w:w="60"/>
-              <w:right w:type="dxa" w:w="90"/>
-            </w:tcMar>
-          </w:tcPr>
-          <w:p>
-            <w:pPr>
-              <w:spacing w:after="0" w:line="252"/>
-            </w:pPr>
-            <w:r>
-              <w:rPr>
-                <w:rFonts w:ascii="Calibri" w:cs="Calibri" w:eastAsia="Calibri" w:hAnsi="Calibri"/>
-                <w:b w:val="false"/>
-                <w:bCs w:val="false"/>
-                <w:i w:val="false"/>
-                <w:iCs w:val="false"/>
-                <w:color w:val="1F2933"/>
-                <w:sz w:val="19"/>
-                <w:szCs w:val="19"/>
-              </w:rPr>
-              <w:t xml:space="preserve">Chi phí đã đặt hàng hoặc đã duyệt nhưng chưa phát sinh</w:t>
-            </w:r>
-          </w:p>
-        </w:tc>
-      </w:tr>
-      <w:tr>
-        <w:trPr>
-          <w:cantSplit/>
-        </w:trPr>
-        <w:tc>
-          <w:tcPr>
-            <w:tcW w:type="dxa" w:w="3215"/>
-            <w:tcMar>
-              <w:top w:type="dxa" w:w="60"/>
-              <w:left w:type="dxa" w:w="90"/>
-              <w:bottom w:type="dxa" w:w="60"/>
-              <w:right w:type="dxa" w:w="90"/>
-            </w:tcMar>
-          </w:tcPr>
-          <w:p>
-            <w:pPr>
-              <w:spacing w:after="0" w:line="252"/>
-            </w:pPr>
-            <w:r>
-              <w:rPr>
-                <w:rFonts w:ascii="Calibri" w:cs="Calibri" w:eastAsia="Calibri" w:hAnsi="Calibri"/>
-                <w:b/>
-                <w:bCs/>
-                <w:i w:val="false"/>
-                <w:iCs w:val="false"/>
-                <w:color w:val="1F2933"/>
-                <w:sz w:val="19"/>
-                <w:szCs w:val="19"/>
-              </w:rPr>
-              <w:t xml:space="preserve">Lãi/lỗ dự kiến</w:t>
-            </w:r>
-          </w:p>
-        </w:tc>
-        <w:tc>
-          <w:tcPr>
-            <w:tcW w:type="dxa" w:w="6423"/>
-            <w:tcMar>
-              <w:top w:type="dxa" w:w="60"/>
-              <w:left w:type="dxa" w:w="90"/>
-              <w:bottom w:type="dxa" w:w="60"/>
-              <w:right w:type="dxa" w:w="90"/>
-            </w:tcMar>
-          </w:tcPr>
-          <w:p>
-            <w:pPr>
-              <w:spacing w:after="0" w:line="252"/>
-            </w:pPr>
-            <w:r>
-              <w:rPr>
-                <w:rFonts w:ascii="Calibri" w:cs="Calibri" w:eastAsia="Calibri" w:hAnsi="Calibri"/>
-                <w:b w:val="false"/>
-                <w:bCs w:val="false"/>
-                <w:i w:val="false"/>
-                <w:iCs w:val="false"/>
-                <w:color w:val="1F2933"/>
-                <w:sz w:val="19"/>
-                <w:szCs w:val="19"/>
-              </w:rPr>
-              <w:t xml:space="preserve">Theo dự toán đã duyệt lúc lập ngân sách — không đổi theo thời gian</w:t>
-            </w:r>
-          </w:p>
-        </w:tc>
-      </w:tr>
-      <w:tr>
-        <w:trPr>
-          <w:cantSplit/>
-        </w:trPr>
-        <w:tc>
-          <w:tcPr>
-            <w:tcW w:type="dxa" w:w="3215"/>
-            <w:tcMar>
-              <w:top w:type="dxa" w:w="60"/>
-              <w:left w:type="dxa" w:w="90"/>
-              <w:bottom w:type="dxa" w:w="60"/>
-              <w:right w:type="dxa" w:w="90"/>
-            </w:tcMar>
-          </w:tcPr>
-          <w:p>
-            <w:pPr>
-              <w:spacing w:after="0" w:line="252"/>
-            </w:pPr>
-            <w:r>
-              <w:rPr>
-                <w:rFonts w:ascii="Calibri" w:cs="Calibri" w:eastAsia="Calibri" w:hAnsi="Calibri"/>
-                <w:b/>
-                <w:bCs/>
-                <w:i w:val="false"/>
-                <w:iCs w:val="false"/>
-                <w:color w:val="1F2933"/>
-                <w:sz w:val="19"/>
-                <w:szCs w:val="19"/>
-              </w:rPr>
-              <w:t xml:space="preserve">Lãi/lỗ thực tế</w:t>
-            </w:r>
-          </w:p>
-        </w:tc>
-        <w:tc>
-          <w:tcPr>
-            <w:tcW w:type="dxa" w:w="6423"/>
-            <w:tcMar>
-              <w:top w:type="dxa" w:w="60"/>
-              <w:left w:type="dxa" w:w="90"/>
-              <w:bottom w:type="dxa" w:w="60"/>
-              <w:right w:type="dxa" w:w="90"/>
-            </w:tcMar>
-          </w:tcPr>
-          <w:p>
-            <w:pPr>
-              <w:spacing w:after="0" w:line="252"/>
-            </w:pPr>
-            <w:r>
-              <w:rPr>
-                <w:rFonts w:ascii="Calibri" w:cs="Calibri" w:eastAsia="Calibri" w:hAnsi="Calibri"/>
-                <w:b w:val="false"/>
-                <w:bCs w:val="false"/>
-                <w:i w:val="false"/>
-                <w:iCs w:val="false"/>
-                <w:color w:val="1F2933"/>
-                <w:sz w:val="19"/>
-                <w:szCs w:val="19"/>
-              </w:rPr>
-              <w:t xml:space="preserve">Đã nghiệm thu − giá vốn thực tế. Ghi theo khối lượng đã nghiệm thu, không theo cả hợp đồng</w:t>
-            </w:r>
-          </w:p>
-        </w:tc>
-      </w:tr>
-    </w:tbl>
-    <w:p>
-      <w:pPr>
-        <w:spacing w:after="160"/>
-      </w:pPr>
-    </w:p>
-    <w:p>
-      <w:pPr>
-        <w:spacing w:after="140" w:line="276"/>
-        <w:jc w:val="left"/>
-      </w:pPr>
-      <w:r>
-        <w:rPr>
-          <w:rFonts w:ascii="Calibri" w:cs="Calibri" w:eastAsia="Calibri" w:hAnsi="Calibri"/>
-          <w:b/>
-          <w:bCs/>
-          <w:i w:val="false"/>
-          <w:iCs w:val="false"/>
-          <w:color w:val="1F2933"/>
-          <w:sz w:val="21"/>
-          <w:szCs w:val="21"/>
-        </w:rPr>
-        <w:t xml:space="preserve">Truy ngược:</w:t>
-      </w:r>
-      <w:r>
-        <w:rPr>
-          <w:rFonts w:ascii="Calibri" w:cs="Calibri" w:eastAsia="Calibri" w:hAnsi="Calibri"/>
-          <w:b w:val="false"/>
-          <w:bCs w:val="false"/>
-          <w:i w:val="false"/>
-          <w:iCs w:val="false"/>
-          <w:color w:val="1F2933"/>
-          <w:sz w:val="21"/>
-          <w:szCs w:val="21"/>
-        </w:rPr>
-        <w:t xml:space="preserve"> bấm tên công trình để mở tab </w:t>
-      </w:r>
-      <w:r>
-        <w:rPr>
-          <w:rFonts w:ascii="Calibri" w:cs="Calibri" w:eastAsia="Calibri" w:hAnsi="Calibri"/>
-          <w:b/>
-          <w:bCs/>
-          <w:i w:val="false"/>
-          <w:iCs w:val="false"/>
-          <w:color w:val="1F2933"/>
-          <w:sz w:val="21"/>
-          <w:szCs w:val="21"/>
-        </w:rPr>
-        <w:t xml:space="preserve">Ngân sách</w:t>
-      </w:r>
-      <w:r>
-        <w:rPr>
-          <w:rFonts w:ascii="Calibri" w:cs="Calibri" w:eastAsia="Calibri" w:hAnsi="Calibri"/>
-          <w:b w:val="false"/>
-          <w:bCs w:val="false"/>
-          <w:i w:val="false"/>
-          <w:iCs w:val="false"/>
-          <w:color w:val="1F2933"/>
-          <w:sz w:val="21"/>
-          <w:szCs w:val="21"/>
-        </w:rPr>
-        <w:t xml:space="preserve"> của công trình — từng mã chi phí với ngân sách, đã phát sinh, đã cam kết, còn được chi.</w:t>
+        <w:t xml:space="preserve">Hình 4 — Tổng quan tài chính: bốn ô chỉ số, biểu đồ doanh thu và tiền đã thu.</w:t>
       </w:r>
     </w:p>
     <w:p>
@@ -3606,78 +3487,7 @@
           <w:sz w:val="18"/>
           <w:szCs w:val="18"/>
         </w:rPr>
-        <w:t xml:space="preserve">Hình 5 — Tab Ngân sách của công trình — từng mã chi phí.</w:t>
-      </w:r>
-    </w:p>
-    <w:p>
-      <w:pPr>
-        <w:spacing w:after="140" w:line="276"/>
-        <w:jc w:val="left"/>
-      </w:pPr>
-      <w:r>
-        <w:rPr>
-          <w:rFonts w:ascii="Calibri" w:cs="Calibri" w:eastAsia="Calibri" w:hAnsi="Calibri"/>
-          <w:b w:val="false"/>
-          <w:bCs w:val="false"/>
-          <w:i w:val="false"/>
-          <w:iCs w:val="false"/>
-          <w:color w:val="1F2933"/>
-          <w:sz w:val="21"/>
-          <w:szCs w:val="21"/>
-        </w:rPr>
-        <w:t xml:space="preserve">Nút </w:t>
-      </w:r>
-      <w:r>
-        <w:rPr>
-          <w:rFonts w:ascii="Calibri" w:cs="Calibri" w:eastAsia="Calibri" w:hAnsi="Calibri"/>
-          <w:b/>
-          <w:bCs/>
-          <w:i w:val="false"/>
-          <w:iCs w:val="false"/>
-          <w:color w:val="1F2933"/>
-          <w:sz w:val="21"/>
-          <w:szCs w:val="21"/>
-        </w:rPr>
-        <w:t xml:space="preserve">Xuất Excel</w:t>
-      </w:r>
-      <w:r>
-        <w:rPr>
-          <w:rFonts w:ascii="Calibri" w:cs="Calibri" w:eastAsia="Calibri" w:hAnsi="Calibri"/>
-          <w:b w:val="false"/>
-          <w:bCs w:val="false"/>
-          <w:i w:val="false"/>
-          <w:iCs w:val="false"/>
-          <w:color w:val="1F2933"/>
-          <w:sz w:val="21"/>
-          <w:szCs w:val="21"/>
-        </w:rPr>
-        <w:t xml:space="preserve"> và </w:t>
-      </w:r>
-      <w:r>
-        <w:rPr>
-          <w:rFonts w:ascii="Calibri" w:cs="Calibri" w:eastAsia="Calibri" w:hAnsi="Calibri"/>
-          <w:b/>
-          <w:bCs/>
-          <w:i w:val="false"/>
-          <w:iCs w:val="false"/>
-          <w:color w:val="1F2933"/>
-          <w:sz w:val="21"/>
-          <w:szCs w:val="21"/>
-        </w:rPr>
-        <w:t xml:space="preserve">Xuất PDF</w:t>
-      </w:r>
-      <w:r>
-        <w:rPr>
-          <w:rFonts w:ascii="Calibri" w:cs="Calibri" w:eastAsia="Calibri" w:hAnsi="Calibri"/>
-          <w:b w:val="false"/>
-          <w:bCs w:val="false"/>
-          <w:i w:val="false"/>
-          <w:iCs w:val="false"/>
-          <w:color w:val="1F2933"/>
-          <w:sz w:val="21"/>
-          <w:szCs w:val="21"/>
-        </w:rPr>
-        <w:t xml:space="preserve"> ở góc trên xuất đúng số liệu đang hiện trên màn hình.</w:t>
+        <w:t xml:space="preserve">Hình 5 — Thu – chi kèm bảng số theo kỳ; công nợ theo tuổi nợ; lãi/lỗ theo công trình.</w:t>
       </w:r>
     </w:p>
     <w:p>
@@ -3699,7 +3509,33 @@
           <w:sz w:val="21"/>
           <w:szCs w:val="21"/>
         </w:rPr>
-        <w:t xml:space="preserve">Số lãi/lỗ, giá vốn chỉ hiện với vai trò được phép xem, và mỗi lượt xem được ghi lại. Người không có quyền không thấy thẻ và không mở được báo cáo.</w:t>
+        <w:t xml:space="preserve">Mọi con số theo </w:t>
+      </w:r>
+      <w:r>
+        <w:rPr>
+          <w:rFonts w:ascii="Calibri" w:cs="Calibri" w:eastAsia="Calibri" w:hAnsi="Calibri"/>
+          <w:b/>
+          <w:bCs/>
+          <w:i w:val="false"/>
+          <w:iCs w:val="false"/>
+          <w:color w:val="1F2933"/>
+          <w:sz w:val="21"/>
+          <w:szCs w:val="21"/>
+        </w:rPr>
+        <w:t xml:space="preserve">ngày nghiệp vụ</w:t>
+      </w:r>
+      <w:r>
+        <w:rPr>
+          <w:rFonts w:ascii="Calibri" w:cs="Calibri" w:eastAsia="Calibri" w:hAnsi="Calibri"/>
+          <w:b w:val="false"/>
+          <w:bCs w:val="false"/>
+          <w:i w:val="false"/>
+          <w:iCs w:val="false"/>
+          <w:color w:val="1F2933"/>
+          <w:sz w:val="21"/>
+          <w:szCs w:val="21"/>
+        </w:rPr>
+        <w:t xml:space="preserve">: doanh thu theo ngày nghiệm thu với chủ đầu tư, tiền thu theo ngày thu, tiền chi theo ngày chi — không theo ngày nhập liệu. Nhập bù hôm nay cho việc tháng trước thì số rơi vào tháng trước.</w:t>
       </w:r>
     </w:p>
     <w:p>
@@ -3716,7 +3552,7 @@
           <w:sz w:val="30"/>
           <w:szCs w:val="30"/>
         </w:rPr>
-        <w:t xml:space="preserve">6. Hiệu quả kinh doanh</w:t>
+        <w:t xml:space="preserve">6. Lãi/lỗ theo công trình</w:t>
       </w:r>
     </w:p>
     <w:p>
@@ -3727,6 +3563,19 @@
       <w:r>
         <w:rPr>
           <w:rFonts w:ascii="Calibri" w:cs="Calibri" w:eastAsia="Calibri" w:hAnsi="Calibri"/>
+          <w:b/>
+          <w:bCs/>
+          <w:i w:val="false"/>
+          <w:iCs w:val="false"/>
+          <w:color w:val="1F2933"/>
+          <w:sz w:val="21"/>
+          <w:szCs w:val="21"/>
+        </w:rPr>
+        <w:t xml:space="preserve">Báo cáo &amp; Dashboard → Lãi/lỗ theo công trình</w:t>
+      </w:r>
+      <w:r>
+        <w:rPr>
+          <w:rFonts w:ascii="Calibri" w:cs="Calibri" w:eastAsia="Calibri" w:hAnsi="Calibri"/>
           <w:b w:val="false"/>
           <w:bCs w:val="false"/>
           <w:i w:val="false"/>
@@ -3735,20 +3584,20 @@
           <w:sz w:val="21"/>
           <w:szCs w:val="21"/>
         </w:rPr>
-        <w:t xml:space="preserve">Tab </w:t>
-      </w:r>
-      <w:r>
-        <w:rPr>
-          <w:rFonts w:ascii="Calibri" w:cs="Calibri" w:eastAsia="Calibri" w:hAnsi="Calibri"/>
-          <w:b/>
-          <w:bCs/>
-          <w:i w:val="false"/>
-          <w:iCs w:val="false"/>
-          <w:color w:val="1F2933"/>
-          <w:sz w:val="21"/>
-          <w:szCs w:val="21"/>
-        </w:rPr>
-        <w:t xml:space="preserve">Hiệu quả kinh doanh</w:t>
+        <w:t xml:space="preserve">, hoặc bấm thẻ </w:t>
+      </w:r>
+      <w:r>
+        <w:rPr>
+          <w:rFonts w:ascii="Calibri" w:cs="Calibri" w:eastAsia="Calibri" w:hAnsi="Calibri"/>
+          <w:b/>
+          <w:bCs/>
+          <w:i w:val="false"/>
+          <w:iCs w:val="false"/>
+          <w:color w:val="1F2933"/>
+          <w:sz w:val="21"/>
+          <w:szCs w:val="21"/>
+        </w:rPr>
+        <w:t xml:space="preserve">Lãi/lỗ theo công trình</w:t>
       </w:r>
       <w:r>
         <w:rPr>
@@ -3761,33 +3610,7 @@
           <w:sz w:val="21"/>
           <w:szCs w:val="21"/>
         </w:rPr>
-        <w:t xml:space="preserve"> cạnh báo cáo lãi/lỗ: theo pháp nhân (số cơ hội, đã ký, tỷ lệ chuyển đổi, tỷ lệ trúng thầu), theo nguồn khách, và phễu bán hàng theo giai đoạn hiện tại. Chỗ chưa có đủ hồ sơ ghi </w:t>
-      </w:r>
-      <w:r>
-        <w:rPr>
-          <w:rFonts w:ascii="Calibri" w:cs="Calibri" w:eastAsia="Calibri" w:hAnsi="Calibri"/>
-          <w:b/>
-          <w:bCs/>
-          <w:i w:val="false"/>
-          <w:iCs w:val="false"/>
-          <w:color w:val="1F2933"/>
-          <w:sz w:val="21"/>
-          <w:szCs w:val="21"/>
-        </w:rPr>
-        <w:t xml:space="preserve">«Chưa có dữ liệu»</w:t>
-      </w:r>
-      <w:r>
-        <w:rPr>
-          <w:rFonts w:ascii="Calibri" w:cs="Calibri" w:eastAsia="Calibri" w:hAnsi="Calibri"/>
-          <w:b w:val="false"/>
-          <w:bCs w:val="false"/>
-          <w:i w:val="false"/>
-          <w:iCs w:val="false"/>
-          <w:color w:val="1F2933"/>
-          <w:sz w:val="21"/>
-          <w:szCs w:val="21"/>
-        </w:rPr>
-        <w:t xml:space="preserve"> thay vì 0 %.</w:t>
+        <w:t xml:space="preserve">.</w:t>
       </w:r>
     </w:p>
     <w:p>
@@ -3851,25 +3674,499 @@
           <w:sz w:val="18"/>
           <w:szCs w:val="18"/>
         </w:rPr>
-        <w:t xml:space="preserve">Hình 6 — Hiệu quả kinh doanh: theo pháp nhân, theo nguồn khách, phễu bán hàng.</w:t>
-      </w:r>
-    </w:p>
-    <w:p>
-      <w:pPr>
-        <w:pStyle w:val="Heading1"/>
-        <w:spacing w:after="160" w:before="360"/>
-      </w:pPr>
-      <w:r>
-        <w:rPr>
-          <w:rFonts w:ascii="Calibri" w:cs="Calibri" w:eastAsia="Calibri" w:hAnsi="Calibri"/>
-          <w:b/>
-          <w:bCs/>
-          <w:color w:val="1F5F4B"/>
-          <w:sz w:val="30"/>
-          <w:szCs w:val="30"/>
-        </w:rPr>
-        <w:t xml:space="preserve">7. Theo dõi công trường</w:t>
-      </w:r>
+        <w:t xml:space="preserve">Hình 6 — Báo cáo lãi/lỗ theo công trình.</w:t>
+      </w:r>
+    </w:p>
+    <w:tbl>
+      <w:tblPr>
+        <w:tblW w:type="dxa" w:w="9638"/>
+        <w:tblBorders>
+          <w:top w:val="single" w:color="C9D2CE" w:sz="4"/>
+          <w:left w:val="single" w:color="C9D2CE" w:sz="4"/>
+          <w:bottom w:val="single" w:color="C9D2CE" w:sz="4"/>
+          <w:right w:val="single" w:color="C9D2CE" w:sz="4"/>
+          <w:insideH w:val="single" w:color="C9D2CE" w:sz="4"/>
+          <w:insideV w:val="single" w:color="C9D2CE" w:sz="4"/>
+        </w:tblBorders>
+      </w:tblPr>
+      <w:tblGrid>
+        <w:gridCol w:w="3215"/>
+        <w:gridCol w:w="6423"/>
+      </w:tblGrid>
+      <w:tr>
+        <w:trPr>
+          <w:tblHeader/>
+        </w:trPr>
+        <w:tc>
+          <w:tcPr>
+            <w:tcW w:type="dxa" w:w="3215"/>
+            <w:shd w:fill="EAF1EE" w:color="auto" w:val="clear"/>
+            <w:tcMar>
+              <w:top w:type="dxa" w:w="60"/>
+              <w:left w:type="dxa" w:w="90"/>
+              <w:bottom w:type="dxa" w:w="60"/>
+              <w:right w:type="dxa" w:w="90"/>
+            </w:tcMar>
+          </w:tcPr>
+          <w:p>
+            <w:pPr>
+              <w:spacing w:after="0" w:line="252"/>
+            </w:pPr>
+            <w:r>
+              <w:rPr>
+                <w:rFonts w:ascii="Calibri" w:cs="Calibri" w:eastAsia="Calibri" w:hAnsi="Calibri"/>
+                <w:b/>
+                <w:bCs/>
+                <w:i w:val="false"/>
+                <w:iCs w:val="false"/>
+                <w:color w:val="1F2933"/>
+                <w:sz w:val="19"/>
+                <w:szCs w:val="19"/>
+              </w:rPr>
+              <w:t xml:space="preserve">Cột</w:t>
+            </w:r>
+          </w:p>
+        </w:tc>
+        <w:tc>
+          <w:tcPr>
+            <w:tcW w:type="dxa" w:w="6423"/>
+            <w:shd w:fill="EAF1EE" w:color="auto" w:val="clear"/>
+            <w:tcMar>
+              <w:top w:type="dxa" w:w="60"/>
+              <w:left w:type="dxa" w:w="90"/>
+              <w:bottom w:type="dxa" w:w="60"/>
+              <w:right w:type="dxa" w:w="90"/>
+            </w:tcMar>
+          </w:tcPr>
+          <w:p>
+            <w:pPr>
+              <w:spacing w:after="0" w:line="252"/>
+            </w:pPr>
+            <w:r>
+              <w:rPr>
+                <w:rFonts w:ascii="Calibri" w:cs="Calibri" w:eastAsia="Calibri" w:hAnsi="Calibri"/>
+                <w:b/>
+                <w:bCs/>
+                <w:i w:val="false"/>
+                <w:iCs w:val="false"/>
+                <w:color w:val="1F2933"/>
+                <w:sz w:val="19"/>
+                <w:szCs w:val="19"/>
+              </w:rPr>
+              <w:t xml:space="preserve">Cách tính</w:t>
+            </w:r>
+          </w:p>
+        </w:tc>
+      </w:tr>
+      <w:tr>
+        <w:trPr>
+          <w:cantSplit/>
+        </w:trPr>
+        <w:tc>
+          <w:tcPr>
+            <w:tcW w:type="dxa" w:w="3215"/>
+            <w:tcMar>
+              <w:top w:type="dxa" w:w="60"/>
+              <w:left w:type="dxa" w:w="90"/>
+              <w:bottom w:type="dxa" w:w="60"/>
+              <w:right w:type="dxa" w:w="90"/>
+            </w:tcMar>
+          </w:tcPr>
+          <w:p>
+            <w:pPr>
+              <w:spacing w:after="0" w:line="252"/>
+            </w:pPr>
+            <w:r>
+              <w:rPr>
+                <w:rFonts w:ascii="Calibri" w:cs="Calibri" w:eastAsia="Calibri" w:hAnsi="Calibri"/>
+                <w:b/>
+                <w:bCs/>
+                <w:i w:val="false"/>
+                <w:iCs w:val="false"/>
+                <w:color w:val="1F2933"/>
+                <w:sz w:val="19"/>
+                <w:szCs w:val="19"/>
+              </w:rPr>
+              <w:t xml:space="preserve">Giá trị hợp đồng</w:t>
+            </w:r>
+          </w:p>
+        </w:tc>
+        <w:tc>
+          <w:tcPr>
+            <w:tcW w:type="dxa" w:w="6423"/>
+            <w:tcMar>
+              <w:top w:type="dxa" w:w="60"/>
+              <w:left w:type="dxa" w:w="90"/>
+              <w:bottom w:type="dxa" w:w="60"/>
+              <w:right w:type="dxa" w:w="90"/>
+            </w:tcMar>
+          </w:tcPr>
+          <w:p>
+            <w:pPr>
+              <w:spacing w:after="0" w:line="252"/>
+            </w:pPr>
+            <w:r>
+              <w:rPr>
+                <w:rFonts w:ascii="Calibri" w:cs="Calibri" w:eastAsia="Calibri" w:hAnsi="Calibri"/>
+                <w:b w:val="false"/>
+                <w:bCs w:val="false"/>
+                <w:i w:val="false"/>
+                <w:iCs w:val="false"/>
+                <w:color w:val="1F2933"/>
+                <w:sz w:val="19"/>
+                <w:szCs w:val="19"/>
+              </w:rPr>
+              <w:t xml:space="preserve">Giá trị hợp đồng đã ký với chủ đầu tư</w:t>
+            </w:r>
+          </w:p>
+        </w:tc>
+      </w:tr>
+      <w:tr>
+        <w:trPr>
+          <w:cantSplit/>
+        </w:trPr>
+        <w:tc>
+          <w:tcPr>
+            <w:tcW w:type="dxa" w:w="3215"/>
+            <w:tcMar>
+              <w:top w:type="dxa" w:w="60"/>
+              <w:left w:type="dxa" w:w="90"/>
+              <w:bottom w:type="dxa" w:w="60"/>
+              <w:right w:type="dxa" w:w="90"/>
+            </w:tcMar>
+          </w:tcPr>
+          <w:p>
+            <w:pPr>
+              <w:spacing w:after="0" w:line="252"/>
+            </w:pPr>
+            <w:r>
+              <w:rPr>
+                <w:rFonts w:ascii="Calibri" w:cs="Calibri" w:eastAsia="Calibri" w:hAnsi="Calibri"/>
+                <w:b/>
+                <w:bCs/>
+                <w:i w:val="false"/>
+                <w:iCs w:val="false"/>
+                <w:color w:val="1F2933"/>
+                <w:sz w:val="19"/>
+                <w:szCs w:val="19"/>
+              </w:rPr>
+              <w:t xml:space="preserve">Đã nghiệm thu</w:t>
+            </w:r>
+          </w:p>
+        </w:tc>
+        <w:tc>
+          <w:tcPr>
+            <w:tcW w:type="dxa" w:w="6423"/>
+            <w:tcMar>
+              <w:top w:type="dxa" w:w="60"/>
+              <w:left w:type="dxa" w:w="90"/>
+              <w:bottom w:type="dxa" w:w="60"/>
+              <w:right w:type="dxa" w:w="90"/>
+            </w:tcMar>
+          </w:tcPr>
+          <w:p>
+            <w:pPr>
+              <w:spacing w:after="0" w:line="252"/>
+            </w:pPr>
+            <w:r>
+              <w:rPr>
+                <w:rFonts w:ascii="Calibri" w:cs="Calibri" w:eastAsia="Calibri" w:hAnsi="Calibri"/>
+                <w:b w:val="false"/>
+                <w:bCs w:val="false"/>
+                <w:i w:val="false"/>
+                <w:iCs w:val="false"/>
+                <w:color w:val="1F2933"/>
+                <w:sz w:val="19"/>
+                <w:szCs w:val="19"/>
+              </w:rPr>
+              <w:t xml:space="preserve">Tổng giá trị các biên bản nghiệm thu </w:t>
+            </w:r>
+            <w:r>
+              <w:rPr>
+                <w:rFonts w:ascii="Calibri" w:cs="Calibri" w:eastAsia="Calibri" w:hAnsi="Calibri"/>
+                <w:b/>
+                <w:bCs/>
+                <w:i w:val="false"/>
+                <w:iCs w:val="false"/>
+                <w:color w:val="1F2933"/>
+                <w:sz w:val="19"/>
+                <w:szCs w:val="19"/>
+              </w:rPr>
+              <w:t xml:space="preserve">với chủ đầu tư</w:t>
+            </w:r>
+            <w:r>
+              <w:rPr>
+                <w:rFonts w:ascii="Calibri" w:cs="Calibri" w:eastAsia="Calibri" w:hAnsi="Calibri"/>
+                <w:b w:val="false"/>
+                <w:bCs w:val="false"/>
+                <w:i w:val="false"/>
+                <w:iCs w:val="false"/>
+                <w:color w:val="1F2933"/>
+                <w:sz w:val="19"/>
+                <w:szCs w:val="19"/>
+              </w:rPr>
+              <w:t xml:space="preserve"> — căn cứ ghi doanh thu</w:t>
+            </w:r>
+          </w:p>
+        </w:tc>
+      </w:tr>
+      <w:tr>
+        <w:trPr>
+          <w:cantSplit/>
+        </w:trPr>
+        <w:tc>
+          <w:tcPr>
+            <w:tcW w:type="dxa" w:w="3215"/>
+            <w:tcMar>
+              <w:top w:type="dxa" w:w="60"/>
+              <w:left w:type="dxa" w:w="90"/>
+              <w:bottom w:type="dxa" w:w="60"/>
+              <w:right w:type="dxa" w:w="90"/>
+            </w:tcMar>
+          </w:tcPr>
+          <w:p>
+            <w:pPr>
+              <w:spacing w:after="0" w:line="252"/>
+            </w:pPr>
+            <w:r>
+              <w:rPr>
+                <w:rFonts w:ascii="Calibri" w:cs="Calibri" w:eastAsia="Calibri" w:hAnsi="Calibri"/>
+                <w:b/>
+                <w:bCs/>
+                <w:i w:val="false"/>
+                <w:iCs w:val="false"/>
+                <w:color w:val="1F2933"/>
+                <w:sz w:val="19"/>
+                <w:szCs w:val="19"/>
+              </w:rPr>
+              <w:t xml:space="preserve">Giá vốn thực tế</w:t>
+            </w:r>
+          </w:p>
+        </w:tc>
+        <w:tc>
+          <w:tcPr>
+            <w:tcW w:type="dxa" w:w="6423"/>
+            <w:tcMar>
+              <w:top w:type="dxa" w:w="60"/>
+              <w:left w:type="dxa" w:w="90"/>
+              <w:bottom w:type="dxa" w:w="60"/>
+              <w:right w:type="dxa" w:w="90"/>
+            </w:tcMar>
+          </w:tcPr>
+          <w:p>
+            <w:pPr>
+              <w:spacing w:after="0" w:line="252"/>
+            </w:pPr>
+            <w:r>
+              <w:rPr>
+                <w:rFonts w:ascii="Calibri" w:cs="Calibri" w:eastAsia="Calibri" w:hAnsi="Calibri"/>
+                <w:b w:val="false"/>
+                <w:bCs w:val="false"/>
+                <w:i w:val="false"/>
+                <w:iCs w:val="false"/>
+                <w:color w:val="1F2933"/>
+                <w:sz w:val="19"/>
+                <w:szCs w:val="19"/>
+              </w:rPr>
+              <w:t xml:space="preserve">Chi phí đã phát sinh tới hôm nay, cộng từ phiếu xuất kho, đơn hàng, đề nghị thanh toán đã chi</w:t>
+            </w:r>
+          </w:p>
+        </w:tc>
+      </w:tr>
+      <w:tr>
+        <w:trPr>
+          <w:cantSplit/>
+        </w:trPr>
+        <w:tc>
+          <w:tcPr>
+            <w:tcW w:type="dxa" w:w="3215"/>
+            <w:tcMar>
+              <w:top w:type="dxa" w:w="60"/>
+              <w:left w:type="dxa" w:w="90"/>
+              <w:bottom w:type="dxa" w:w="60"/>
+              <w:right w:type="dxa" w:w="90"/>
+            </w:tcMar>
+          </w:tcPr>
+          <w:p>
+            <w:pPr>
+              <w:spacing w:after="0" w:line="252"/>
+            </w:pPr>
+            <w:r>
+              <w:rPr>
+                <w:rFonts w:ascii="Calibri" w:cs="Calibri" w:eastAsia="Calibri" w:hAnsi="Calibri"/>
+                <w:b/>
+                <w:bCs/>
+                <w:i w:val="false"/>
+                <w:iCs w:val="false"/>
+                <w:color w:val="1F2933"/>
+                <w:sz w:val="19"/>
+                <w:szCs w:val="19"/>
+              </w:rPr>
+              <w:t xml:space="preserve">Đã cam kết</w:t>
+            </w:r>
+          </w:p>
+        </w:tc>
+        <w:tc>
+          <w:tcPr>
+            <w:tcW w:type="dxa" w:w="6423"/>
+            <w:tcMar>
+              <w:top w:type="dxa" w:w="60"/>
+              <w:left w:type="dxa" w:w="90"/>
+              <w:bottom w:type="dxa" w:w="60"/>
+              <w:right w:type="dxa" w:w="90"/>
+            </w:tcMar>
+          </w:tcPr>
+          <w:p>
+            <w:pPr>
+              <w:spacing w:after="0" w:line="252"/>
+            </w:pPr>
+            <w:r>
+              <w:rPr>
+                <w:rFonts w:ascii="Calibri" w:cs="Calibri" w:eastAsia="Calibri" w:hAnsi="Calibri"/>
+                <w:b w:val="false"/>
+                <w:bCs w:val="false"/>
+                <w:i w:val="false"/>
+                <w:iCs w:val="false"/>
+                <w:color w:val="1F2933"/>
+                <w:sz w:val="19"/>
+                <w:szCs w:val="19"/>
+              </w:rPr>
+              <w:t xml:space="preserve">Chi phí đã đặt hàng hoặc đã duyệt nhưng chưa phát sinh</w:t>
+            </w:r>
+          </w:p>
+        </w:tc>
+      </w:tr>
+      <w:tr>
+        <w:trPr>
+          <w:cantSplit/>
+        </w:trPr>
+        <w:tc>
+          <w:tcPr>
+            <w:tcW w:type="dxa" w:w="3215"/>
+            <w:tcMar>
+              <w:top w:type="dxa" w:w="60"/>
+              <w:left w:type="dxa" w:w="90"/>
+              <w:bottom w:type="dxa" w:w="60"/>
+              <w:right w:type="dxa" w:w="90"/>
+            </w:tcMar>
+          </w:tcPr>
+          <w:p>
+            <w:pPr>
+              <w:spacing w:after="0" w:line="252"/>
+            </w:pPr>
+            <w:r>
+              <w:rPr>
+                <w:rFonts w:ascii="Calibri" w:cs="Calibri" w:eastAsia="Calibri" w:hAnsi="Calibri"/>
+                <w:b/>
+                <w:bCs/>
+                <w:i w:val="false"/>
+                <w:iCs w:val="false"/>
+                <w:color w:val="1F2933"/>
+                <w:sz w:val="19"/>
+                <w:szCs w:val="19"/>
+              </w:rPr>
+              <w:t xml:space="preserve">Lãi/lỗ dự kiến</w:t>
+            </w:r>
+          </w:p>
+        </w:tc>
+        <w:tc>
+          <w:tcPr>
+            <w:tcW w:type="dxa" w:w="6423"/>
+            <w:tcMar>
+              <w:top w:type="dxa" w:w="60"/>
+              <w:left w:type="dxa" w:w="90"/>
+              <w:bottom w:type="dxa" w:w="60"/>
+              <w:right w:type="dxa" w:w="90"/>
+            </w:tcMar>
+          </w:tcPr>
+          <w:p>
+            <w:pPr>
+              <w:spacing w:after="0" w:line="252"/>
+            </w:pPr>
+            <w:r>
+              <w:rPr>
+                <w:rFonts w:ascii="Calibri" w:cs="Calibri" w:eastAsia="Calibri" w:hAnsi="Calibri"/>
+                <w:b w:val="false"/>
+                <w:bCs w:val="false"/>
+                <w:i w:val="false"/>
+                <w:iCs w:val="false"/>
+                <w:color w:val="1F2933"/>
+                <w:sz w:val="19"/>
+                <w:szCs w:val="19"/>
+              </w:rPr>
+              <w:t xml:space="preserve">Theo dự toán đã duyệt lúc lập ngân sách — không đổi theo thời gian</w:t>
+            </w:r>
+          </w:p>
+        </w:tc>
+      </w:tr>
+      <w:tr>
+        <w:trPr>
+          <w:cantSplit/>
+        </w:trPr>
+        <w:tc>
+          <w:tcPr>
+            <w:tcW w:type="dxa" w:w="3215"/>
+            <w:tcMar>
+              <w:top w:type="dxa" w:w="60"/>
+              <w:left w:type="dxa" w:w="90"/>
+              <w:bottom w:type="dxa" w:w="60"/>
+              <w:right w:type="dxa" w:w="90"/>
+            </w:tcMar>
+          </w:tcPr>
+          <w:p>
+            <w:pPr>
+              <w:spacing w:after="0" w:line="252"/>
+            </w:pPr>
+            <w:r>
+              <w:rPr>
+                <w:rFonts w:ascii="Calibri" w:cs="Calibri" w:eastAsia="Calibri" w:hAnsi="Calibri"/>
+                <w:b/>
+                <w:bCs/>
+                <w:i w:val="false"/>
+                <w:iCs w:val="false"/>
+                <w:color w:val="1F2933"/>
+                <w:sz w:val="19"/>
+                <w:szCs w:val="19"/>
+              </w:rPr>
+              <w:t xml:space="preserve">Lãi/lỗ thực tế</w:t>
+            </w:r>
+          </w:p>
+        </w:tc>
+        <w:tc>
+          <w:tcPr>
+            <w:tcW w:type="dxa" w:w="6423"/>
+            <w:tcMar>
+              <w:top w:type="dxa" w:w="60"/>
+              <w:left w:type="dxa" w:w="90"/>
+              <w:bottom w:type="dxa" w:w="60"/>
+              <w:right w:type="dxa" w:w="90"/>
+            </w:tcMar>
+          </w:tcPr>
+          <w:p>
+            <w:pPr>
+              <w:spacing w:after="0" w:line="252"/>
+            </w:pPr>
+            <w:r>
+              <w:rPr>
+                <w:rFonts w:ascii="Calibri" w:cs="Calibri" w:eastAsia="Calibri" w:hAnsi="Calibri"/>
+                <w:b w:val="false"/>
+                <w:bCs w:val="false"/>
+                <w:i w:val="false"/>
+                <w:iCs w:val="false"/>
+                <w:color w:val="1F2933"/>
+                <w:sz w:val="19"/>
+                <w:szCs w:val="19"/>
+              </w:rPr>
+              <w:t xml:space="preserve">Đã nghiệm thu − giá vốn thực tế. Ghi theo khối lượng đã nghiệm thu, không theo cả hợp đồng</w:t>
+            </w:r>
+          </w:p>
+        </w:tc>
+      </w:tr>
+    </w:tbl>
+    <w:p>
+      <w:pPr>
+        <w:spacing w:after="160"/>
+      </w:pPr>
     </w:p>
     <w:p>
       <w:pPr>
@@ -3887,7 +4184,7 @@
           <w:sz w:val="21"/>
           <w:szCs w:val="21"/>
         </w:rPr>
-        <w:t xml:space="preserve">Thi công &amp; Ngân sách → Công trình → Theo dõi đề nghị</w:t>
+        <w:t xml:space="preserve">Truy ngược:</w:t>
       </w:r>
       <w:r>
         <w:rPr>
@@ -3900,20 +4197,20 @@
           <w:sz w:val="21"/>
           <w:szCs w:val="21"/>
         </w:rPr>
-        <w:t xml:space="preserve">, chọn </w:t>
-      </w:r>
-      <w:r>
-        <w:rPr>
-          <w:rFonts w:ascii="Calibri" w:cs="Calibri" w:eastAsia="Calibri" w:hAnsi="Calibri"/>
-          <w:b/>
-          <w:bCs/>
-          <w:i w:val="false"/>
-          <w:iCs w:val="false"/>
-          <w:color w:val="1F2933"/>
-          <w:sz w:val="21"/>
-          <w:szCs w:val="21"/>
-        </w:rPr>
-        <w:t xml:space="preserve">Tất cả công trình</w:t>
+        <w:t xml:space="preserve"> bấm tên công trình để mở tab </w:t>
+      </w:r>
+      <w:r>
+        <w:rPr>
+          <w:rFonts w:ascii="Calibri" w:cs="Calibri" w:eastAsia="Calibri" w:hAnsi="Calibri"/>
+          <w:b/>
+          <w:bCs/>
+          <w:i w:val="false"/>
+          <w:iCs w:val="false"/>
+          <w:color w:val="1F2933"/>
+          <w:sz w:val="21"/>
+          <w:szCs w:val="21"/>
+        </w:rPr>
+        <w:t xml:space="preserve">Ngân sách</w:t>
       </w:r>
       <w:r>
         <w:rPr>
@@ -3926,33 +4223,7 @@
           <w:sz w:val="21"/>
           <w:szCs w:val="21"/>
         </w:rPr>
-        <w:t xml:space="preserve">: mọi đề nghị vật tư từ công trường, đang ở bước nào, </w:t>
-      </w:r>
-      <w:r>
-        <w:rPr>
-          <w:rFonts w:ascii="Calibri" w:cs="Calibri" w:eastAsia="Calibri" w:hAnsi="Calibri"/>
-          <w:b/>
-          <w:bCs/>
-          <w:i w:val="false"/>
-          <w:iCs w:val="false"/>
-          <w:color w:val="1F2933"/>
-          <w:sz w:val="21"/>
-          <w:szCs w:val="21"/>
-        </w:rPr>
-        <w:t xml:space="preserve">ai đang giữ</w:t>
-      </w:r>
-      <w:r>
-        <w:rPr>
-          <w:rFonts w:ascii="Calibri" w:cs="Calibri" w:eastAsia="Calibri" w:hAnsi="Calibri"/>
-          <w:b w:val="false"/>
-          <w:bCs w:val="false"/>
-          <w:i w:val="false"/>
-          <w:iCs w:val="false"/>
-          <w:color w:val="1F2933"/>
-          <w:sz w:val="21"/>
-          <w:szCs w:val="21"/>
-        </w:rPr>
-        <w:t xml:space="preserve">, đã chờ bao lâu, còn bao lâu tới hạn xử lý. Đây là cùng màn hình chỉ huy trưởng dùng — hai bên nhìn cùng một số liệu.</w:t>
+        <w:t xml:space="preserve"> của công trình — từng mã chi phí với ngân sách, đã phát sinh, đã cam kết, còn được chi.</w:t>
       </w:r>
     </w:p>
     <w:p>
@@ -4016,7 +4287,7 @@
           <w:sz w:val="18"/>
           <w:szCs w:val="18"/>
         </w:rPr>
-        <w:t xml:space="preserve">Hình 7 — Theo dõi đề nghị, tất cả công trình.</w:t>
+        <w:t xml:space="preserve">Hình 7 — Tab Ngân sách của công trình — từng mã chi phí.</w:t>
       </w:r>
     </w:p>
     <w:p>
@@ -4035,20 +4306,20 @@
           <w:sz w:val="21"/>
           <w:szCs w:val="21"/>
         </w:rPr>
-        <w:t xml:space="preserve">Trong trang từng công trình, tab </w:t>
-      </w:r>
-      <w:r>
-        <w:rPr>
-          <w:rFonts w:ascii="Calibri" w:cs="Calibri" w:eastAsia="Calibri" w:hAnsi="Calibri"/>
-          <w:b/>
-          <w:bCs/>
-          <w:i w:val="false"/>
-          <w:iCs w:val="false"/>
-          <w:color w:val="1F2933"/>
-          <w:sz w:val="21"/>
-          <w:szCs w:val="21"/>
-        </w:rPr>
-        <w:t xml:space="preserve">Điểm danh</w:t>
+        <w:t xml:space="preserve">Nút </w:t>
+      </w:r>
+      <w:r>
+        <w:rPr>
+          <w:rFonts w:ascii="Calibri" w:cs="Calibri" w:eastAsia="Calibri" w:hAnsi="Calibri"/>
+          <w:b/>
+          <w:bCs/>
+          <w:i w:val="false"/>
+          <w:iCs w:val="false"/>
+          <w:color w:val="1F2933"/>
+          <w:sz w:val="21"/>
+          <w:szCs w:val="21"/>
+        </w:rPr>
+        <w:t xml:space="preserve">Xuất Excel</w:t>
       </w:r>
       <w:r>
         <w:rPr>
@@ -4061,7 +4332,55 @@
           <w:sz w:val="21"/>
           <w:szCs w:val="21"/>
         </w:rPr>
-        <w:t xml:space="preserve"> cho xem ảnh điểm danh của nhân sự theo ngày (bằng chứng có mặt; chưa liên kết bảng chấm công).</w:t>
+        <w:t xml:space="preserve"> và </w:t>
+      </w:r>
+      <w:r>
+        <w:rPr>
+          <w:rFonts w:ascii="Calibri" w:cs="Calibri" w:eastAsia="Calibri" w:hAnsi="Calibri"/>
+          <w:b/>
+          <w:bCs/>
+          <w:i w:val="false"/>
+          <w:iCs w:val="false"/>
+          <w:color w:val="1F2933"/>
+          <w:sz w:val="21"/>
+          <w:szCs w:val="21"/>
+        </w:rPr>
+        <w:t xml:space="preserve">Xuất PDF</w:t>
+      </w:r>
+      <w:r>
+        <w:rPr>
+          <w:rFonts w:ascii="Calibri" w:cs="Calibri" w:eastAsia="Calibri" w:hAnsi="Calibri"/>
+          <w:b w:val="false"/>
+          <w:bCs w:val="false"/>
+          <w:i w:val="false"/>
+          <w:iCs w:val="false"/>
+          <w:color w:val="1F2933"/>
+          <w:sz w:val="21"/>
+          <w:szCs w:val="21"/>
+        </w:rPr>
+        <w:t xml:space="preserve"> ở góc trên xuất đúng số liệu đang hiện trên màn hình.</w:t>
+      </w:r>
+    </w:p>
+    <w:p>
+      <w:pPr>
+        <w:pBdr>
+          <w:left w:val="single" w:color="1F5F4B" w:sz="12" w:space="10"/>
+        </w:pBdr>
+        <w:spacing w:after="160" w:before="120" w:line="276"/>
+        <w:ind w:left="220"/>
+      </w:pPr>
+      <w:r>
+        <w:rPr>
+          <w:rFonts w:ascii="Calibri" w:cs="Calibri" w:eastAsia="Calibri" w:hAnsi="Calibri"/>
+          <w:b w:val="false"/>
+          <w:bCs w:val="false"/>
+          <w:i w:val="false"/>
+          <w:iCs w:val="false"/>
+          <w:color w:val="1F2933"/>
+          <w:sz w:val="21"/>
+          <w:szCs w:val="21"/>
+        </w:rPr>
+        <w:t xml:space="preserve">Số lãi/lỗ, giá vốn chỉ hiện với vai trò được phép xem, và mỗi lượt xem được ghi lại. Người không có quyền không thấy thẻ và không mở được báo cáo.</w:t>
       </w:r>
     </w:p>
     <w:p>
@@ -4078,7 +4397,7 @@
           <w:sz w:val="30"/>
           <w:szCs w:val="30"/>
         </w:rPr>
-        <w:t xml:space="preserve">8. Thời hạn xử lý và hạn mức phê duyệt</w:t>
+        <w:t xml:space="preserve">7. Hiệu quả kinh doanh</w:t>
       </w:r>
     </w:p>
     <w:p>
@@ -4097,20 +4416,20 @@
           <w:sz w:val="21"/>
           <w:szCs w:val="21"/>
         </w:rPr>
-        <w:t xml:space="preserve">Hai bảng quy định cách hồ sơ chạy trong hệ thống. </w:t>
-      </w:r>
-      <w:r>
-        <w:rPr>
-          <w:rFonts w:ascii="Calibri" w:cs="Calibri" w:eastAsia="Calibri" w:hAnsi="Calibri"/>
-          <w:b/>
-          <w:bCs/>
-          <w:i w:val="false"/>
-          <w:iCs w:val="false"/>
-          <w:color w:val="1F2933"/>
-          <w:sz w:val="21"/>
-          <w:szCs w:val="21"/>
-        </w:rPr>
-        <w:t xml:space="preserve">Ban Giám đốc quyết định con số; Quản trị viên nhập</w:t>
+        <w:t xml:space="preserve">Tab </w:t>
+      </w:r>
+      <w:r>
+        <w:rPr>
+          <w:rFonts w:ascii="Calibri" w:cs="Calibri" w:eastAsia="Calibri" w:hAnsi="Calibri"/>
+          <w:b/>
+          <w:bCs/>
+          <w:i w:val="false"/>
+          <w:iCs w:val="false"/>
+          <w:color w:val="1F2933"/>
+          <w:sz w:val="21"/>
+          <w:szCs w:val="21"/>
+        </w:rPr>
+        <w:t xml:space="preserve">Hiệu quả kinh doanh</w:t>
       </w:r>
       <w:r>
         <w:rPr>
@@ -4123,30 +4442,20 @@
           <w:sz w:val="21"/>
           <w:szCs w:val="21"/>
         </w:rPr>
-        <w:t xml:space="preserve"> ở phân hệ Quản trị hệ thống. Không cần sửa phần mềm khi quy chế thay đổi.</w:t>
-      </w:r>
-    </w:p>
-    <w:p>
-      <w:pPr>
-        <w:pStyle w:val="ListParagraph"/>
-        <w:numPr>
-          <w:ilvl w:val="0"/>
-          <w:numId w:val="2"/>
-        </w:numPr>
-        <w:spacing w:after="70" w:line="276"/>
-      </w:pPr>
-      <w:r>
-        <w:rPr>
-          <w:rFonts w:ascii="Calibri" w:cs="Calibri" w:eastAsia="Calibri" w:hAnsi="Calibri"/>
-          <w:b/>
-          <w:bCs/>
-          <w:i w:val="false"/>
-          <w:iCs w:val="false"/>
-          <w:color w:val="1F2933"/>
-          <w:sz w:val="21"/>
-          <w:szCs w:val="21"/>
-        </w:rPr>
-        <w:t xml:space="preserve">Thời hạn xử lý</w:t>
+        <w:t xml:space="preserve"> cạnh báo cáo lãi/lỗ: theo pháp nhân (số cơ hội, đã ký, tỷ lệ chuyển đổi, tỷ lệ trúng thầu), theo nguồn khách, và phễu bán hàng theo giai đoạn hiện tại. Chỗ chưa có đủ hồ sơ ghi </w:t>
+      </w:r>
+      <w:r>
+        <w:rPr>
+          <w:rFonts w:ascii="Calibri" w:cs="Calibri" w:eastAsia="Calibri" w:hAnsi="Calibri"/>
+          <w:b/>
+          <w:bCs/>
+          <w:i w:val="false"/>
+          <w:iCs w:val="false"/>
+          <w:color w:val="1F2933"/>
+          <w:sz w:val="21"/>
+          <w:szCs w:val="21"/>
+        </w:rPr>
+        <w:t xml:space="preserve">«Chưa có dữ liệu»</w:t>
       </w:r>
       <w:r>
         <w:rPr>
@@ -4159,43 +4468,7 @@
           <w:sz w:val="21"/>
           <w:szCs w:val="21"/>
         </w:rPr>
-        <w:t xml:space="preserve"> — mỗi loại đề nghị phải được xử lý trong bao lâu. Đồng hồ hạn xử lý trên Hộp thư phê duyệt, trên màn hình Theo dõi đề nghị của công trường, và cảnh báo quá hạn đều đọc bảng này. Loại nào chưa khai thì màn hình ghi «Chưa có thời hạn cam kết» — hệ thống không tự đặt số.</w:t>
-      </w:r>
-    </w:p>
-    <w:p>
-      <w:pPr>
-        <w:pStyle w:val="ListParagraph"/>
-        <w:numPr>
-          <w:ilvl w:val="0"/>
-          <w:numId w:val="2"/>
-        </w:numPr>
-        <w:spacing w:after="70" w:line="276"/>
-      </w:pPr>
-      <w:r>
-        <w:rPr>
-          <w:rFonts w:ascii="Calibri" w:cs="Calibri" w:eastAsia="Calibri" w:hAnsi="Calibri"/>
-          <w:b/>
-          <w:bCs/>
-          <w:i w:val="false"/>
-          <w:iCs w:val="false"/>
-          <w:color w:val="1F2933"/>
-          <w:sz w:val="21"/>
-          <w:szCs w:val="21"/>
-        </w:rPr>
-        <w:t xml:space="preserve">Hạn mức phê duyệt</w:t>
-      </w:r>
-      <w:r>
-        <w:rPr>
-          <w:rFonts w:ascii="Calibri" w:cs="Calibri" w:eastAsia="Calibri" w:hAnsi="Calibri"/>
-          <w:b w:val="false"/>
-          <w:bCs w:val="false"/>
-          <w:i w:val="false"/>
-          <w:iCs w:val="false"/>
-          <w:color w:val="1F2933"/>
-          <w:sz w:val="21"/>
-          <w:szCs w:val="21"/>
-        </w:rPr>
-        <w:t xml:space="preserve"> — vai trò nào duyệt loại hồ sơ nào, tới mức tiền nào, ở bước thứ mấy.</w:t>
+        <w:t xml:space="preserve"> thay vì 0 %.</w:t>
       </w:r>
     </w:p>
     <w:p>
@@ -4259,7 +4532,108 @@
           <w:sz w:val="18"/>
           <w:szCs w:val="18"/>
         </w:rPr>
-        <w:t xml:space="preserve">Hình 8 — Thời hạn xử lý (màn hình của Quản trị viên). Hai mức trong bản demo là mức tạm.</w:t>
+        <w:t xml:space="preserve">Hình 8 — Hiệu quả kinh doanh: theo pháp nhân, theo nguồn khách, phễu bán hàng.</w:t>
+      </w:r>
+    </w:p>
+    <w:p>
+      <w:pPr>
+        <w:pStyle w:val="Heading1"/>
+        <w:spacing w:after="160" w:before="360"/>
+      </w:pPr>
+      <w:r>
+        <w:rPr>
+          <w:rFonts w:ascii="Calibri" w:cs="Calibri" w:eastAsia="Calibri" w:hAnsi="Calibri"/>
+          <w:b/>
+          <w:bCs/>
+          <w:color w:val="1F5F4B"/>
+          <w:sz w:val="30"/>
+          <w:szCs w:val="30"/>
+        </w:rPr>
+        <w:t xml:space="preserve">8. Theo dõi công trường</w:t>
+      </w:r>
+    </w:p>
+    <w:p>
+      <w:pPr>
+        <w:spacing w:after="140" w:line="276"/>
+        <w:jc w:val="left"/>
+      </w:pPr>
+      <w:r>
+        <w:rPr>
+          <w:rFonts w:ascii="Calibri" w:cs="Calibri" w:eastAsia="Calibri" w:hAnsi="Calibri"/>
+          <w:b/>
+          <w:bCs/>
+          <w:i w:val="false"/>
+          <w:iCs w:val="false"/>
+          <w:color w:val="1F2933"/>
+          <w:sz w:val="21"/>
+          <w:szCs w:val="21"/>
+        </w:rPr>
+        <w:t xml:space="preserve">Thi công &amp; Ngân sách → Công trình → Theo dõi đề nghị</w:t>
+      </w:r>
+      <w:r>
+        <w:rPr>
+          <w:rFonts w:ascii="Calibri" w:cs="Calibri" w:eastAsia="Calibri" w:hAnsi="Calibri"/>
+          <w:b w:val="false"/>
+          <w:bCs w:val="false"/>
+          <w:i w:val="false"/>
+          <w:iCs w:val="false"/>
+          <w:color w:val="1F2933"/>
+          <w:sz w:val="21"/>
+          <w:szCs w:val="21"/>
+        </w:rPr>
+        <w:t xml:space="preserve">, chọn </w:t>
+      </w:r>
+      <w:r>
+        <w:rPr>
+          <w:rFonts w:ascii="Calibri" w:cs="Calibri" w:eastAsia="Calibri" w:hAnsi="Calibri"/>
+          <w:b/>
+          <w:bCs/>
+          <w:i w:val="false"/>
+          <w:iCs w:val="false"/>
+          <w:color w:val="1F2933"/>
+          <w:sz w:val="21"/>
+          <w:szCs w:val="21"/>
+        </w:rPr>
+        <w:t xml:space="preserve">Tất cả công trình</w:t>
+      </w:r>
+      <w:r>
+        <w:rPr>
+          <w:rFonts w:ascii="Calibri" w:cs="Calibri" w:eastAsia="Calibri" w:hAnsi="Calibri"/>
+          <w:b w:val="false"/>
+          <w:bCs w:val="false"/>
+          <w:i w:val="false"/>
+          <w:iCs w:val="false"/>
+          <w:color w:val="1F2933"/>
+          <w:sz w:val="21"/>
+          <w:szCs w:val="21"/>
+        </w:rPr>
+        <w:t xml:space="preserve">: mọi đề nghị vật tư từ công trường, đang ở bước nào, </w:t>
+      </w:r>
+      <w:r>
+        <w:rPr>
+          <w:rFonts w:ascii="Calibri" w:cs="Calibri" w:eastAsia="Calibri" w:hAnsi="Calibri"/>
+          <w:b/>
+          <w:bCs/>
+          <w:i w:val="false"/>
+          <w:iCs w:val="false"/>
+          <w:color w:val="1F2933"/>
+          <w:sz w:val="21"/>
+          <w:szCs w:val="21"/>
+        </w:rPr>
+        <w:t xml:space="preserve">ai đang giữ</w:t>
+      </w:r>
+      <w:r>
+        <w:rPr>
+          <w:rFonts w:ascii="Calibri" w:cs="Calibri" w:eastAsia="Calibri" w:hAnsi="Calibri"/>
+          <w:b w:val="false"/>
+          <w:bCs w:val="false"/>
+          <w:i w:val="false"/>
+          <w:iCs w:val="false"/>
+          <w:color w:val="1F2933"/>
+          <w:sz w:val="21"/>
+          <w:szCs w:val="21"/>
+        </w:rPr>
+        <w:t xml:space="preserve">, đã chờ bao lâu, còn bao lâu tới hạn xử lý. Đây là cùng màn hình chỉ huy trưởng dùng — hai bên nhìn cùng một số liệu.</w:t>
       </w:r>
     </w:p>
     <w:p>
@@ -4323,7 +4697,52 @@
           <w:sz w:val="18"/>
           <w:szCs w:val="18"/>
         </w:rPr>
-        <w:t xml:space="preserve">Hình 9 — Hạn mức phê duyệt (màn hình của Quản trị viên) — mức tạm theo tài liệu, chờ quy chế chính thức.</w:t>
+        <w:t xml:space="preserve">Hình 9 — Theo dõi đề nghị, tất cả công trình.</w:t>
+      </w:r>
+    </w:p>
+    <w:p>
+      <w:pPr>
+        <w:spacing w:after="140" w:line="276"/>
+        <w:jc w:val="left"/>
+      </w:pPr>
+      <w:r>
+        <w:rPr>
+          <w:rFonts w:ascii="Calibri" w:cs="Calibri" w:eastAsia="Calibri" w:hAnsi="Calibri"/>
+          <w:b w:val="false"/>
+          <w:bCs w:val="false"/>
+          <w:i w:val="false"/>
+          <w:iCs w:val="false"/>
+          <w:color w:val="1F2933"/>
+          <w:sz w:val="21"/>
+          <w:szCs w:val="21"/>
+        </w:rPr>
+        <w:t xml:space="preserve">Trong trang từng công trình, tab </w:t>
+      </w:r>
+      <w:r>
+        <w:rPr>
+          <w:rFonts w:ascii="Calibri" w:cs="Calibri" w:eastAsia="Calibri" w:hAnsi="Calibri"/>
+          <w:b/>
+          <w:bCs/>
+          <w:i w:val="false"/>
+          <w:iCs w:val="false"/>
+          <w:color w:val="1F2933"/>
+          <w:sz w:val="21"/>
+          <w:szCs w:val="21"/>
+        </w:rPr>
+        <w:t xml:space="preserve">Điểm danh</w:t>
+      </w:r>
+      <w:r>
+        <w:rPr>
+          <w:rFonts w:ascii="Calibri" w:cs="Calibri" w:eastAsia="Calibri" w:hAnsi="Calibri"/>
+          <w:b w:val="false"/>
+          <w:bCs w:val="false"/>
+          <w:i w:val="false"/>
+          <w:iCs w:val="false"/>
+          <w:color w:val="1F2933"/>
+          <w:sz w:val="21"/>
+          <w:szCs w:val="21"/>
+        </w:rPr>
+        <w:t xml:space="preserve"> cho xem ảnh điểm danh của nhân sự theo ngày (bằng chứng có mặt; chưa liên kết bảng chấm công).</w:t>
       </w:r>
     </w:p>
     <w:p>
@@ -4340,7 +4759,269 @@
           <w:sz w:val="30"/>
           <w:szCs w:val="30"/>
         </w:rPr>
-        <w:t xml:space="preserve">9. Câu hỏi thường gặp</w:t>
+        <w:t xml:space="preserve">9. Thời hạn xử lý và hạn mức phê duyệt</w:t>
+      </w:r>
+    </w:p>
+    <w:p>
+      <w:pPr>
+        <w:spacing w:after="140" w:line="276"/>
+        <w:jc w:val="left"/>
+      </w:pPr>
+      <w:r>
+        <w:rPr>
+          <w:rFonts w:ascii="Calibri" w:cs="Calibri" w:eastAsia="Calibri" w:hAnsi="Calibri"/>
+          <w:b w:val="false"/>
+          <w:bCs w:val="false"/>
+          <w:i w:val="false"/>
+          <w:iCs w:val="false"/>
+          <w:color w:val="1F2933"/>
+          <w:sz w:val="21"/>
+          <w:szCs w:val="21"/>
+        </w:rPr>
+        <w:t xml:space="preserve">Hai bảng quy định cách hồ sơ chạy trong hệ thống. </w:t>
+      </w:r>
+      <w:r>
+        <w:rPr>
+          <w:rFonts w:ascii="Calibri" w:cs="Calibri" w:eastAsia="Calibri" w:hAnsi="Calibri"/>
+          <w:b/>
+          <w:bCs/>
+          <w:i w:val="false"/>
+          <w:iCs w:val="false"/>
+          <w:color w:val="1F2933"/>
+          <w:sz w:val="21"/>
+          <w:szCs w:val="21"/>
+        </w:rPr>
+        <w:t xml:space="preserve">Ban Giám đốc quyết định con số; Quản trị viên nhập</w:t>
+      </w:r>
+      <w:r>
+        <w:rPr>
+          <w:rFonts w:ascii="Calibri" w:cs="Calibri" w:eastAsia="Calibri" w:hAnsi="Calibri"/>
+          <w:b w:val="false"/>
+          <w:bCs w:val="false"/>
+          <w:i w:val="false"/>
+          <w:iCs w:val="false"/>
+          <w:color w:val="1F2933"/>
+          <w:sz w:val="21"/>
+          <w:szCs w:val="21"/>
+        </w:rPr>
+        <w:t xml:space="preserve"> ở phân hệ Quản trị hệ thống. Không cần sửa phần mềm khi quy chế thay đổi.</w:t>
+      </w:r>
+    </w:p>
+    <w:p>
+      <w:pPr>
+        <w:pStyle w:val="ListParagraph"/>
+        <w:numPr>
+          <w:ilvl w:val="0"/>
+          <w:numId w:val="2"/>
+        </w:numPr>
+        <w:spacing w:after="70" w:line="276"/>
+      </w:pPr>
+      <w:r>
+        <w:rPr>
+          <w:rFonts w:ascii="Calibri" w:cs="Calibri" w:eastAsia="Calibri" w:hAnsi="Calibri"/>
+          <w:b/>
+          <w:bCs/>
+          <w:i w:val="false"/>
+          <w:iCs w:val="false"/>
+          <w:color w:val="1F2933"/>
+          <w:sz w:val="21"/>
+          <w:szCs w:val="21"/>
+        </w:rPr>
+        <w:t xml:space="preserve">Thời hạn xử lý</w:t>
+      </w:r>
+      <w:r>
+        <w:rPr>
+          <w:rFonts w:ascii="Calibri" w:cs="Calibri" w:eastAsia="Calibri" w:hAnsi="Calibri"/>
+          <w:b w:val="false"/>
+          <w:bCs w:val="false"/>
+          <w:i w:val="false"/>
+          <w:iCs w:val="false"/>
+          <w:color w:val="1F2933"/>
+          <w:sz w:val="21"/>
+          <w:szCs w:val="21"/>
+        </w:rPr>
+        <w:t xml:space="preserve"> — mỗi loại đề nghị phải được xử lý trong bao lâu. Đồng hồ hạn xử lý trên Hộp thư phê duyệt, trên màn hình Theo dõi đề nghị của công trường, và cảnh báo quá hạn đều đọc bảng này. Loại nào chưa khai thì màn hình ghi «Chưa có thời hạn cam kết» — hệ thống không tự đặt số.</w:t>
+      </w:r>
+    </w:p>
+    <w:p>
+      <w:pPr>
+        <w:pStyle w:val="ListParagraph"/>
+        <w:numPr>
+          <w:ilvl w:val="0"/>
+          <w:numId w:val="2"/>
+        </w:numPr>
+        <w:spacing w:after="70" w:line="276"/>
+      </w:pPr>
+      <w:r>
+        <w:rPr>
+          <w:rFonts w:ascii="Calibri" w:cs="Calibri" w:eastAsia="Calibri" w:hAnsi="Calibri"/>
+          <w:b/>
+          <w:bCs/>
+          <w:i w:val="false"/>
+          <w:iCs w:val="false"/>
+          <w:color w:val="1F2933"/>
+          <w:sz w:val="21"/>
+          <w:szCs w:val="21"/>
+        </w:rPr>
+        <w:t xml:space="preserve">Hạn mức phê duyệt</w:t>
+      </w:r>
+      <w:r>
+        <w:rPr>
+          <w:rFonts w:ascii="Calibri" w:cs="Calibri" w:eastAsia="Calibri" w:hAnsi="Calibri"/>
+          <w:b w:val="false"/>
+          <w:bCs w:val="false"/>
+          <w:i w:val="false"/>
+          <w:iCs w:val="false"/>
+          <w:color w:val="1F2933"/>
+          <w:sz w:val="21"/>
+          <w:szCs w:val="21"/>
+        </w:rPr>
+        <w:t xml:space="preserve"> — vai trò nào duyệt loại hồ sơ nào, tới mức tiền nào, ở bước thứ mấy.</w:t>
+      </w:r>
+    </w:p>
+    <w:p>
+      <w:pPr>
+        <w:keepNext/>
+        <w:spacing w:after="60" w:before="160"/>
+        <w:jc w:val="center"/>
+      </w:pPr>
+      <w:r>
+        <w:drawing>
+          <wp:inline distT="0" distB="0" distL="0" distR="0">
+            <wp:extent cx="6191250" cy="3867150"/>
+            <wp:effectExtent t="0" r="0" b="0" l="0"/>
+            <wp:docPr id="10" name="" descr="" title=""/>
+            <wp:cNvGraphicFramePr>
+              <a:graphicFrameLocks xmlns:a="http://schemas.openxmlformats.org/drawingml/2006/main" noChangeAspect="1"/>
+            </wp:cNvGraphicFramePr>
+            <a:graphic xmlns:a="http://schemas.openxmlformats.org/drawingml/2006/main">
+              <a:graphicData uri="http://schemas.openxmlformats.org/drawingml/2006/picture">
+                <pic:pic xmlns:pic="http://schemas.openxmlformats.org/drawingml/2006/picture">
+                  <pic:nvPicPr>
+                    <pic:cNvPr id="0" name="" descr=""/>
+                    <pic:cNvPicPr>
+                      <a:picLocks noChangeAspect="1" noChangeArrowheads="1"/>
+                    </pic:cNvPicPr>
+                  </pic:nvPicPr>
+                  <pic:blipFill>
+                    <a:blip r:embed="rId18" cstate="none"/>
+                    <a:srcRect/>
+                    <a:stretch>
+                      <a:fillRect/>
+                    </a:stretch>
+                  </pic:blipFill>
+                  <pic:spPr bwMode="auto">
+                    <a:xfrm>
+                      <a:off x="0" y="0"/>
+                      <a:ext cx="6191250" cy="3867150"/>
+                    </a:xfrm>
+                    <a:prstGeom prst="rect">
+                      <a:avLst/>
+                    </a:prstGeom>
+                  </pic:spPr>
+                </pic:pic>
+              </a:graphicData>
+            </a:graphic>
+          </wp:inline>
+        </w:drawing>
+      </w:r>
+    </w:p>
+    <w:p>
+      <w:pPr>
+        <w:spacing w:after="200"/>
+        <w:jc w:val="center"/>
+      </w:pPr>
+      <w:r>
+        <w:rPr>
+          <w:rFonts w:ascii="Calibri" w:cs="Calibri" w:eastAsia="Calibri" w:hAnsi="Calibri"/>
+          <w:i/>
+          <w:iCs/>
+          <w:color w:val="52606D"/>
+          <w:sz w:val="18"/>
+          <w:szCs w:val="18"/>
+        </w:rPr>
+        <w:t xml:space="preserve">Hình 10 — Thời hạn xử lý (màn hình của Quản trị viên). Hai mức trong bản demo là mức tạm.</w:t>
+      </w:r>
+    </w:p>
+    <w:p>
+      <w:pPr>
+        <w:keepNext/>
+        <w:spacing w:after="60" w:before="160"/>
+        <w:jc w:val="center"/>
+      </w:pPr>
+      <w:r>
+        <w:drawing>
+          <wp:inline distT="0" distB="0" distL="0" distR="0">
+            <wp:extent cx="6191250" cy="3867150"/>
+            <wp:effectExtent t="0" r="0" b="0" l="0"/>
+            <wp:docPr id="11" name="" descr="" title=""/>
+            <wp:cNvGraphicFramePr>
+              <a:graphicFrameLocks xmlns:a="http://schemas.openxmlformats.org/drawingml/2006/main" noChangeAspect="1"/>
+            </wp:cNvGraphicFramePr>
+            <a:graphic xmlns:a="http://schemas.openxmlformats.org/drawingml/2006/main">
+              <a:graphicData uri="http://schemas.openxmlformats.org/drawingml/2006/picture">
+                <pic:pic xmlns:pic="http://schemas.openxmlformats.org/drawingml/2006/picture">
+                  <pic:nvPicPr>
+                    <pic:cNvPr id="0" name="" descr=""/>
+                    <pic:cNvPicPr>
+                      <a:picLocks noChangeAspect="1" noChangeArrowheads="1"/>
+                    </pic:cNvPicPr>
+                  </pic:nvPicPr>
+                  <pic:blipFill>
+                    <a:blip r:embed="rId19" cstate="none"/>
+                    <a:srcRect/>
+                    <a:stretch>
+                      <a:fillRect/>
+                    </a:stretch>
+                  </pic:blipFill>
+                  <pic:spPr bwMode="auto">
+                    <a:xfrm>
+                      <a:off x="0" y="0"/>
+                      <a:ext cx="6191250" cy="3867150"/>
+                    </a:xfrm>
+                    <a:prstGeom prst="rect">
+                      <a:avLst/>
+                    </a:prstGeom>
+                  </pic:spPr>
+                </pic:pic>
+              </a:graphicData>
+            </a:graphic>
+          </wp:inline>
+        </w:drawing>
+      </w:r>
+    </w:p>
+    <w:p>
+      <w:pPr>
+        <w:spacing w:after="200"/>
+        <w:jc w:val="center"/>
+      </w:pPr>
+      <w:r>
+        <w:rPr>
+          <w:rFonts w:ascii="Calibri" w:cs="Calibri" w:eastAsia="Calibri" w:hAnsi="Calibri"/>
+          <w:i/>
+          <w:iCs/>
+          <w:color w:val="52606D"/>
+          <w:sz w:val="18"/>
+          <w:szCs w:val="18"/>
+        </w:rPr>
+        <w:t xml:space="preserve">Hình 11 — Hạn mức phê duyệt (màn hình của Quản trị viên) — mức tạm theo tài liệu, chờ quy chế chính thức.</w:t>
+      </w:r>
+    </w:p>
+    <w:p>
+      <w:pPr>
+        <w:pStyle w:val="Heading1"/>
+        <w:spacing w:after="160" w:before="360"/>
+      </w:pPr>
+      <w:r>
+        <w:rPr>
+          <w:rFonts w:ascii="Calibri" w:cs="Calibri" w:eastAsia="Calibri" w:hAnsi="Calibri"/>
+          <w:b/>
+          <w:bCs/>
+          <w:color w:val="1F5F4B"/>
+          <w:sz w:val="30"/>
+          <w:szCs w:val="30"/>
+        </w:rPr>
+        <w:t xml:space="preserve">10. Câu hỏi thường gặp</w:t>
       </w:r>
     </w:p>
     <w:tbl>

</xml_diff>

<commit_message>
Chỉ Tổng Giám đốc (và Quản trị viên) sửa hạn mức phê duyệt và thời hạn xử lý
Haan 30/09/2026: «đồng ý, chỉ TGĐ».

- 0141: approval_limits ghi được bởi ADMIN, TGD (trước chỉ ADMIN); sla_definitions thu lại còn
  ADMIN, TGD (trước thêm CFO, BGD). Quyền đọc giữ nguyên.
- Giao diện: TGĐ thấy mục Quản trị hệ thống dẫn thẳng vào Hạn mức, thanh Quản trị chỉ hai tab
  Hạn mức / Thời hạn; các màn hình Quản trị khác vẫn chặn. Nút Chỉnh sửa theo cùng nhóm vai trò
  với chính sách CSDL (APPROVAL_RULE_EDITOR_ROLES).
- Phép thử: CSDL (TGĐ sửa được, CFO không — cả hạn mức lẫn thời hạn), giao diện (tab, đường
  vào, chặn CFO). tc-tracker tạm gỡ rồi trả lại thời hạn có sẵn để không phụ thuộc dữ liệu demo.
- Hướng dẫn Ban Giám đốc, kịch bản demo bước 10, QA D-09 / B-09 / B-10 theo quyền mới.

Co-Authored-By: Claude Opus 5.5 <noreply@anthropic.com>
</commit_message>
<xml_diff>
--- a/doc/demo/huong-dan/02_BAN_GIAM_DOC.docx
+++ b/doc/demo/huong-dan/02_BAN_GIAM_DOC.docx
@@ -722,9 +722,9 @@
         </w:tblBorders>
       </w:tblPr>
       <w:tblGrid>
-        <w:gridCol w:w="4296"/>
-        <w:gridCol w:w="2911"/>
-        <w:gridCol w:w="2431"/>
+        <w:gridCol w:w="4209"/>
+        <w:gridCol w:w="3029"/>
+        <w:gridCol w:w="2400"/>
       </w:tblGrid>
       <w:tr>
         <w:trPr>
@@ -732,7 +732,7 @@
         </w:trPr>
         <w:tc>
           <w:tcPr>
-            <w:tcW w:type="dxa" w:w="4296"/>
+            <w:tcW w:type="dxa" w:w="4209"/>
             <w:shd w:fill="EAF1EE" w:color="auto" w:val="clear"/>
             <w:tcMar>
               <w:top w:type="dxa" w:w="60"/>
@@ -762,7 +762,7 @@
         </w:tc>
         <w:tc>
           <w:tcPr>
-            <w:tcW w:type="dxa" w:w="2911"/>
+            <w:tcW w:type="dxa" w:w="3029"/>
             <w:shd w:fill="EAF1EE" w:color="auto" w:val="clear"/>
             <w:tcMar>
               <w:top w:type="dxa" w:w="60"/>
@@ -792,7 +792,7 @@
         </w:tc>
         <w:tc>
           <w:tcPr>
-            <w:tcW w:type="dxa" w:w="2431"/>
+            <w:tcW w:type="dxa" w:w="2400"/>
             <w:shd w:fill="EAF1EE" w:color="auto" w:val="clear"/>
             <w:tcMar>
               <w:top w:type="dxa" w:w="60"/>
@@ -827,7 +827,7 @@
         </w:trPr>
         <w:tc>
           <w:tcPr>
-            <w:tcW w:type="dxa" w:w="4296"/>
+            <w:tcW w:type="dxa" w:w="4209"/>
             <w:tcMar>
               <w:top w:type="dxa" w:w="60"/>
               <w:left w:type="dxa" w:w="90"/>
@@ -856,7 +856,7 @@
         </w:tc>
         <w:tc>
           <w:tcPr>
-            <w:tcW w:type="dxa" w:w="2911"/>
+            <w:tcW w:type="dxa" w:w="3029"/>
             <w:tcMar>
               <w:top w:type="dxa" w:w="60"/>
               <w:left w:type="dxa" w:w="90"/>
@@ -885,7 +885,7 @@
         </w:tc>
         <w:tc>
           <w:tcPr>
-            <w:tcW w:type="dxa" w:w="2431"/>
+            <w:tcW w:type="dxa" w:w="2400"/>
             <w:tcMar>
               <w:top w:type="dxa" w:w="60"/>
               <w:left w:type="dxa" w:w="90"/>
@@ -919,7 +919,7 @@
         </w:trPr>
         <w:tc>
           <w:tcPr>
-            <w:tcW w:type="dxa" w:w="4296"/>
+            <w:tcW w:type="dxa" w:w="4209"/>
             <w:tcMar>
               <w:top w:type="dxa" w:w="60"/>
               <w:left w:type="dxa" w:w="90"/>
@@ -948,7 +948,7 @@
         </w:tc>
         <w:tc>
           <w:tcPr>
-            <w:tcW w:type="dxa" w:w="2911"/>
+            <w:tcW w:type="dxa" w:w="3029"/>
             <w:tcMar>
               <w:top w:type="dxa" w:w="60"/>
               <w:left w:type="dxa" w:w="90"/>
@@ -990,7 +990,7 @@
         </w:tc>
         <w:tc>
           <w:tcPr>
-            <w:tcW w:type="dxa" w:w="2431"/>
+            <w:tcW w:type="dxa" w:w="2400"/>
             <w:tcMar>
               <w:top w:type="dxa" w:w="60"/>
               <w:left w:type="dxa" w:w="90"/>
@@ -1024,7 +1024,7 @@
         </w:trPr>
         <w:tc>
           <w:tcPr>
-            <w:tcW w:type="dxa" w:w="4296"/>
+            <w:tcW w:type="dxa" w:w="4209"/>
             <w:tcMar>
               <w:top w:type="dxa" w:w="60"/>
               <w:left w:type="dxa" w:w="90"/>
@@ -1053,7 +1053,7 @@
         </w:tc>
         <w:tc>
           <w:tcPr>
-            <w:tcW w:type="dxa" w:w="2911"/>
+            <w:tcW w:type="dxa" w:w="3029"/>
             <w:tcMar>
               <w:top w:type="dxa" w:w="60"/>
               <w:left w:type="dxa" w:w="90"/>
@@ -1082,7 +1082,7 @@
         </w:tc>
         <w:tc>
           <w:tcPr>
-            <w:tcW w:type="dxa" w:w="2431"/>
+            <w:tcW w:type="dxa" w:w="2400"/>
             <w:tcMar>
               <w:top w:type="dxa" w:w="60"/>
               <w:left w:type="dxa" w:w="90"/>
@@ -1116,7 +1116,7 @@
         </w:trPr>
         <w:tc>
           <w:tcPr>
-            <w:tcW w:type="dxa" w:w="4296"/>
+            <w:tcW w:type="dxa" w:w="4209"/>
             <w:tcMar>
               <w:top w:type="dxa" w:w="60"/>
               <w:left w:type="dxa" w:w="90"/>
@@ -1145,7 +1145,7 @@
         </w:tc>
         <w:tc>
           <w:tcPr>
-            <w:tcW w:type="dxa" w:w="2911"/>
+            <w:tcW w:type="dxa" w:w="3029"/>
             <w:tcMar>
               <w:top w:type="dxa" w:w="60"/>
               <w:left w:type="dxa" w:w="90"/>
@@ -1174,7 +1174,7 @@
         </w:tc>
         <w:tc>
           <w:tcPr>
-            <w:tcW w:type="dxa" w:w="2431"/>
+            <w:tcW w:type="dxa" w:w="2400"/>
             <w:tcMar>
               <w:top w:type="dxa" w:w="60"/>
               <w:left w:type="dxa" w:w="90"/>
@@ -1208,7 +1208,7 @@
         </w:trPr>
         <w:tc>
           <w:tcPr>
-            <w:tcW w:type="dxa" w:w="4296"/>
+            <w:tcW w:type="dxa" w:w="4209"/>
             <w:tcMar>
               <w:top w:type="dxa" w:w="60"/>
               <w:left w:type="dxa" w:w="90"/>
@@ -1237,7 +1237,7 @@
         </w:tc>
         <w:tc>
           <w:tcPr>
-            <w:tcW w:type="dxa" w:w="2911"/>
+            <w:tcW w:type="dxa" w:w="3029"/>
             <w:tcMar>
               <w:top w:type="dxa" w:w="60"/>
               <w:left w:type="dxa" w:w="90"/>
@@ -1266,7 +1266,7 @@
         </w:tc>
         <w:tc>
           <w:tcPr>
-            <w:tcW w:type="dxa" w:w="2431"/>
+            <w:tcW w:type="dxa" w:w="2400"/>
             <w:tcMar>
               <w:top w:type="dxa" w:w="60"/>
               <w:left w:type="dxa" w:w="90"/>
@@ -1300,7 +1300,7 @@
         </w:trPr>
         <w:tc>
           <w:tcPr>
-            <w:tcW w:type="dxa" w:w="4296"/>
+            <w:tcW w:type="dxa" w:w="4209"/>
             <w:tcMar>
               <w:top w:type="dxa" w:w="60"/>
               <w:left w:type="dxa" w:w="90"/>
@@ -1329,7 +1329,7 @@
         </w:tc>
         <w:tc>
           <w:tcPr>
-            <w:tcW w:type="dxa" w:w="2911"/>
+            <w:tcW w:type="dxa" w:w="3029"/>
             <w:tcMar>
               <w:top w:type="dxa" w:w="60"/>
               <w:left w:type="dxa" w:w="90"/>
@@ -1358,7 +1358,7 @@
         </w:tc>
         <w:tc>
           <w:tcPr>
-            <w:tcW w:type="dxa" w:w="2431"/>
+            <w:tcW w:type="dxa" w:w="2400"/>
             <w:tcMar>
               <w:top w:type="dxa" w:w="60"/>
               <w:left w:type="dxa" w:w="90"/>
@@ -1392,7 +1392,7 @@
         </w:trPr>
         <w:tc>
           <w:tcPr>
-            <w:tcW w:type="dxa" w:w="4296"/>
+            <w:tcW w:type="dxa" w:w="4209"/>
             <w:tcMar>
               <w:top w:type="dxa" w:w="60"/>
               <w:left w:type="dxa" w:w="90"/>
@@ -1415,24 +1415,37 @@
                 <w:sz w:val="19"/>
                 <w:szCs w:val="19"/>
               </w:rPr>
-              <w:t xml:space="preserve">Quyết định thời hạn xử lý và hạn mức phê duyệt</w:t>
-            </w:r>
-          </w:p>
-        </w:tc>
-        <w:tc>
-          <w:tcPr>
-            <w:tcW w:type="dxa" w:w="2911"/>
-            <w:tcMar>
-              <w:top w:type="dxa" w:w="60"/>
-              <w:left w:type="dxa" w:w="90"/>
-              <w:bottom w:type="dxa" w:w="60"/>
-              <w:right w:type="dxa" w:w="90"/>
-            </w:tcMar>
-          </w:tcPr>
-          <w:p>
-            <w:pPr>
-              <w:spacing w:after="0" w:line="252"/>
-            </w:pPr>
+              <w:t xml:space="preserve">Sửa thời hạn xử lý và hạn mức phê duyệt</w:t>
+            </w:r>
+          </w:p>
+        </w:tc>
+        <w:tc>
+          <w:tcPr>
+            <w:tcW w:type="dxa" w:w="3029"/>
+            <w:tcMar>
+              <w:top w:type="dxa" w:w="60"/>
+              <w:left w:type="dxa" w:w="90"/>
+              <w:bottom w:type="dxa" w:w="60"/>
+              <w:right w:type="dxa" w:w="90"/>
+            </w:tcMar>
+          </w:tcPr>
+          <w:p>
+            <w:pPr>
+              <w:spacing w:after="0" w:line="252"/>
+            </w:pPr>
+            <w:r>
+              <w:rPr>
+                <w:rFonts w:ascii="Calibri" w:cs="Calibri" w:eastAsia="Calibri" w:hAnsi="Calibri"/>
+                <w:b/>
+                <w:bCs/>
+                <w:i w:val="false"/>
+                <w:iCs w:val="false"/>
+                <w:color w:val="1F2933"/>
+                <w:sz w:val="19"/>
+                <w:szCs w:val="19"/>
+              </w:rPr>
+              <w:t xml:space="preserve">Quản trị hệ thống</w:t>
+            </w:r>
             <w:r>
               <w:rPr>
                 <w:rFonts w:ascii="Calibri" w:cs="Calibri" w:eastAsia="Calibri" w:hAnsi="Calibri"/>
@@ -1444,13 +1457,13 @@
                 <w:sz w:val="19"/>
                 <w:szCs w:val="19"/>
               </w:rPr>
-              <w:t xml:space="preserve">Quản trị viên nhập theo quyết định của Ban Giám đốc</w:t>
-            </w:r>
-          </w:p>
-        </w:tc>
-        <w:tc>
-          <w:tcPr>
-            <w:tcW w:type="dxa" w:w="2431"/>
+              <w:t xml:space="preserve"> → Hạn mức phê duyệt / Thời hạn xử lý (chỉ Tổng Giám đốc)</w:t>
+            </w:r>
+          </w:p>
+        </w:tc>
+        <w:tc>
+          <w:tcPr>
+            <w:tcW w:type="dxa" w:w="2400"/>
             <w:tcMar>
               <w:top w:type="dxa" w:w="60"/>
               <w:left w:type="dxa" w:w="90"/>
@@ -4791,20 +4804,46 @@
           <w:sz w:val="21"/>
           <w:szCs w:val="21"/>
         </w:rPr>
-        <w:t xml:space="preserve">Ban Giám đốc quyết định con số; Quản trị viên nhập</w:t>
-      </w:r>
-      <w:r>
-        <w:rPr>
-          <w:rFonts w:ascii="Calibri" w:cs="Calibri" w:eastAsia="Calibri" w:hAnsi="Calibri"/>
-          <w:b w:val="false"/>
-          <w:bCs w:val="false"/>
-          <w:i w:val="false"/>
-          <w:iCs w:val="false"/>
-          <w:color w:val="1F2933"/>
-          <w:sz w:val="21"/>
-          <w:szCs w:val="21"/>
-        </w:rPr>
-        <w:t xml:space="preserve"> ở phân hệ Quản trị hệ thống. Không cần sửa phần mềm khi quy chế thay đổi.</w:t>
+        <w:t xml:space="preserve">Tổng Giám đốc tự sửa</w:t>
+      </w:r>
+      <w:r>
+        <w:rPr>
+          <w:rFonts w:ascii="Calibri" w:cs="Calibri" w:eastAsia="Calibri" w:hAnsi="Calibri"/>
+          <w:b w:val="false"/>
+          <w:bCs w:val="false"/>
+          <w:i w:val="false"/>
+          <w:iCs w:val="false"/>
+          <w:color w:val="1F2933"/>
+          <w:sz w:val="21"/>
+          <w:szCs w:val="21"/>
+        </w:rPr>
+        <w:t xml:space="preserve"> ở mục </w:t>
+      </w:r>
+      <w:r>
+        <w:rPr>
+          <w:rFonts w:ascii="Calibri" w:cs="Calibri" w:eastAsia="Calibri" w:hAnsi="Calibri"/>
+          <w:b/>
+          <w:bCs/>
+          <w:i w:val="false"/>
+          <w:iCs w:val="false"/>
+          <w:color w:val="1F2933"/>
+          <w:sz w:val="21"/>
+          <w:szCs w:val="21"/>
+        </w:rPr>
+        <w:t xml:space="preserve">Quản trị hệ thống</w:t>
+      </w:r>
+      <w:r>
+        <w:rPr>
+          <w:rFonts w:ascii="Calibri" w:cs="Calibri" w:eastAsia="Calibri" w:hAnsi="Calibri"/>
+          <w:b w:val="false"/>
+          <w:bCs w:val="false"/>
+          <w:i w:val="false"/>
+          <w:iCs w:val="false"/>
+          <w:color w:val="1F2933"/>
+          <w:sz w:val="21"/>
+          <w:szCs w:val="21"/>
+        </w:rPr>
+        <w:t xml:space="preserve"> trên thanh bên — mục này với Tổng Giám đốc chỉ có hai màn hình đó; người dùng, tham số và các màn hình quản trị khác vẫn do Quản trị viên phụ trách. Không cần sửa phần mềm khi quy chế thay đổi. Giám đốc Tài chính và các thành viên Ban Giám đốc khác xem được hạn mức nhưng không sửa.</w:t>
       </w:r>
     </w:p>
     <w:p>
@@ -4940,7 +4979,7 @@
           <w:sz w:val="18"/>
           <w:szCs w:val="18"/>
         </w:rPr>
-        <w:t xml:space="preserve">Hình 10 — Thời hạn xử lý (màn hình của Quản trị viên). Hai mức trong bản demo là mức tạm.</w:t>
+        <w:t xml:space="preserve">Hình 10 — Thời hạn xử lý — bấm Chỉnh sửa để đổi số giờ. Hai mức trong bản demo là mức tạm.</w:t>
       </w:r>
     </w:p>
     <w:p>
@@ -5004,7 +5043,7 @@
           <w:sz w:val="18"/>
           <w:szCs w:val="18"/>
         </w:rPr>
-        <w:t xml:space="preserve">Hình 11 — Hạn mức phê duyệt (màn hình của Quản trị viên) — mức tạm theo tài liệu, chờ quy chế chính thức.</w:t>
+        <w:t xml:space="preserve">Hình 11 — Hạn mức phê duyệt — mức tạm theo tài liệu, chờ quy chế chính thức; bấm Chỉnh sửa trên từng dòng.</w:t>
       </w:r>
     </w:p>
     <w:p>
@@ -5352,7 +5391,59 @@
                 <w:sz w:val="19"/>
                 <w:szCs w:val="19"/>
               </w:rPr>
-              <w:t xml:space="preserve">Quyết định con số, rồi nhờ Quản trị viên nhập ở Quản trị hệ thống.</w:t>
+              <w:t xml:space="preserve">Mở </w:t>
+            </w:r>
+            <w:r>
+              <w:rPr>
+                <w:rFonts w:ascii="Calibri" w:cs="Calibri" w:eastAsia="Calibri" w:hAnsi="Calibri"/>
+                <w:b/>
+                <w:bCs/>
+                <w:i w:val="false"/>
+                <w:iCs w:val="false"/>
+                <w:color w:val="1F2933"/>
+                <w:sz w:val="19"/>
+                <w:szCs w:val="19"/>
+              </w:rPr>
+              <w:t xml:space="preserve">Quản trị hệ thống</w:t>
+            </w:r>
+            <w:r>
+              <w:rPr>
+                <w:rFonts w:ascii="Calibri" w:cs="Calibri" w:eastAsia="Calibri" w:hAnsi="Calibri"/>
+                <w:b w:val="false"/>
+                <w:bCs w:val="false"/>
+                <w:i w:val="false"/>
+                <w:iCs w:val="false"/>
+                <w:color w:val="1F2933"/>
+                <w:sz w:val="19"/>
+                <w:szCs w:val="19"/>
+              </w:rPr>
+              <w:t xml:space="preserve"> trên thanh bên → Hạn mức phê duyệt hoặc Thời hạn xử lý → </w:t>
+            </w:r>
+            <w:r>
+              <w:rPr>
+                <w:rFonts w:ascii="Calibri" w:cs="Calibri" w:eastAsia="Calibri" w:hAnsi="Calibri"/>
+                <w:b/>
+                <w:bCs/>
+                <w:i w:val="false"/>
+                <w:iCs w:val="false"/>
+                <w:color w:val="1F2933"/>
+                <w:sz w:val="19"/>
+                <w:szCs w:val="19"/>
+              </w:rPr>
+              <w:t xml:space="preserve">Chỉnh sửa</w:t>
+            </w:r>
+            <w:r>
+              <w:rPr>
+                <w:rFonts w:ascii="Calibri" w:cs="Calibri" w:eastAsia="Calibri" w:hAnsi="Calibri"/>
+                <w:b w:val="false"/>
+                <w:bCs w:val="false"/>
+                <w:i w:val="false"/>
+                <w:iCs w:val="false"/>
+                <w:color w:val="1F2933"/>
+                <w:sz w:val="19"/>
+                <w:szCs w:val="19"/>
+              </w:rPr>
+              <w:t xml:space="preserve">. Chỉ tài khoản Tổng Giám đốc sửa được.</w:t>
             </w:r>
           </w:p>
         </w:tc>

</xml_diff>

<commit_message>
Lời chào theo cấp bậc (chức danh cho lãnh đạo, tên cho nhân viên); «Toàn NVG» đổi thành «NVG Group»
Co-Authored-By: Claude Opus 5.5 <noreply@anthropic.com>
</commit_message>
<xml_diff>
--- a/doc/demo/huong-dan/02_BAN_GIAM_DOC.docx
+++ b/doc/demo/huong-dan/02_BAN_GIAM_DOC.docx
@@ -1579,7 +1579,7 @@
           <w:sz w:val="21"/>
           <w:szCs w:val="21"/>
         </w:rPr>
-        <w:t xml:space="preserve">Toàn NVG</w:t>
+        <w:t xml:space="preserve">NVG Group</w:t>
       </w:r>
       <w:r>
         <w:rPr>
@@ -3310,7 +3310,7 @@
           <w:sz w:val="21"/>
           <w:szCs w:val="21"/>
         </w:rPr>
-        <w:t xml:space="preserve"> khi đang xem Toàn NVG.</w:t>
+        <w:t xml:space="preserve"> khi đang xem NVG Group.</w:t>
       </w:r>
     </w:p>
     <w:p>

</xml_diff>

<commit_message>
Hướng dẫn sử dụng Mua hàng – Vật tư (md, docx, pdf, 14 ảnh); QA: lỗi hiển thị L-09→L-13
Co-Authored-By: Claude Opus 5.5 <noreply@anthropic.com>
</commit_message>
<xml_diff>
--- a/doc/demo/huong-dan/02_BAN_GIAM_DOC.docx
+++ b/doc/demo/huong-dan/02_BAN_GIAM_DOC.docx
@@ -448,7 +448,7 @@
           <w:sz w:val="21"/>
           <w:szCs w:val="21"/>
         </w:rPr>
-        <w:t xml:space="preserve">2. Chọn pháp nhân: từng công ty hay toàn NVG</w:t>
+        <w:t xml:space="preserve">2. Chọn pháp nhân: từng công ty hay NVG Group</w:t>
       </w:r>
     </w:p>
     <w:p>
@@ -1511,7 +1511,7 @@
           <w:sz w:val="30"/>
           <w:szCs w:val="30"/>
         </w:rPr>
-        <w:t xml:space="preserve">2. Chọn pháp nhân: từng công ty hay toàn NVG</w:t>
+        <w:t xml:space="preserve">2. Chọn pháp nhân: từng công ty hay NVG Group</w:t>
       </w:r>
     </w:p>
     <w:p>

</xml_diff>